<commit_message>
docs: fix docx rendering of blockquotes & multi-line bold
Blockquotes and wrapped list items were emitted one source line per paragraph,
so callouts had large gaps and bold spanning a line break (e.g. **commented out
and retired**) showed literal ** markers. The converter now joins wrapped lines
into flowing paragraphs and renders bold/italic (incl. bold-with-italic)
correctly, matching the intended layout.

Co-Authored-By: Claude Opus 4.8 <noreply@anthropic.com>
</commit_message>
<xml_diff>
--- a/docs/ARCHITECTURE.docx
+++ b/docs/ARCHITECTURE.docx
@@ -12,6 +12,10 @@
     </w:p>
     <w:p>
       <w:r>
+        <w:rPr>
+          <w:b w:val="0"/>
+          <w:i w:val="0"/>
+        </w:rPr>
         <w:t>This is the map of the whole system: what each piece is, where it runs, how the pieces talk to each other, which environment variable does what, and where to look when something breaks. Read this first if you're new to the project or you're trying to figure out "which thing is down."</w:t>
       </w:r>
     </w:p>
@@ -22,19 +26,16 @@
       <w:r>
         <w:rPr>
           <w:b/>
+          <w:i w:val="0"/>
         </w:rPr>
         <w:t>About the screenshots.</w:t>
       </w:r>
       <w:r>
-        <w:t xml:space="preserve"> This doc references four dashboard screenshots that live</w:t>
-      </w:r>
-    </w:p>
-    <w:p>
-      <w:pPr>
-        <w:pStyle w:val="IntenseQuote"/>
-      </w:pPr>
-      <w:r>
-        <w:t xml:space="preserve">in </w:t>
+        <w:rPr>
+          <w:b w:val="0"/>
+          <w:i w:val="0"/>
+        </w:rPr>
+        <w:t xml:space="preserve"> This doc references four dashboard screenshots that live in </w:t>
       </w:r>
       <w:hyperlink r:id="rId9">
         <w:r>
@@ -46,7 +47,27 @@
         </w:r>
       </w:hyperlink>
       <w:r>
-        <w:t>. If they're not there yet, save the four captures into</w:t>
+        <w:rPr>
+          <w:b w:val="0"/>
+          <w:i w:val="0"/>
+        </w:rPr>
+        <w:t xml:space="preserve">. If they're not there yet, save the four captures into </w:t>
+      </w:r>
+      <w:r>
+        <w:rPr>
+          <w:rFonts w:ascii="Consolas" w:hAnsi="Consolas"/>
+          <w:b w:val="0"/>
+          <w:i w:val="0"/>
+          <w:sz w:val="19"/>
+        </w:rPr>
+        <w:t>docs/images/</w:t>
+      </w:r>
+      <w:r>
+        <w:rPr>
+          <w:b w:val="0"/>
+          <w:i w:val="0"/>
+        </w:rPr>
+        <w:t xml:space="preserve"> with these exact names:</w:t>
       </w:r>
     </w:p>
     <w:p>
@@ -55,13 +76,130 @@
       </w:pPr>
       <w:r>
         <w:rPr>
+          <w:b w:val="0"/>
+          <w:i w:val="0"/>
+        </w:rPr>
+        <w:t xml:space="preserve">| File | What it shows | |---|---| | </w:t>
+      </w:r>
+      <w:r>
+        <w:rPr>
           <w:rFonts w:ascii="Consolas" w:hAnsi="Consolas"/>
+          <w:b w:val="0"/>
+          <w:i w:val="0"/>
           <w:sz w:val="19"/>
         </w:rPr>
-        <w:t>docs/images/</w:t>
-      </w:r>
-      <w:r>
-        <w:t xml:space="preserve"> with these exact names:</w:t>
+        <w:t>render-flask-env.png</w:t>
+      </w:r>
+      <w:r>
+        <w:rPr>
+          <w:b w:val="0"/>
+          <w:i w:val="0"/>
+        </w:rPr>
+        <w:t xml:space="preserve"> | Render → </w:t>
+      </w:r>
+      <w:r>
+        <w:rPr>
+          <w:b/>
+          <w:i w:val="0"/>
+        </w:rPr>
+        <w:t>Calculator-code</w:t>
+      </w:r>
+      <w:r>
+        <w:rPr>
+          <w:b w:val="0"/>
+          <w:i w:val="0"/>
+        </w:rPr>
+        <w:t xml:space="preserve"> (Flask) → Environment | | </w:t>
+      </w:r>
+      <w:r>
+        <w:rPr>
+          <w:rFonts w:ascii="Consolas" w:hAnsi="Consolas"/>
+          <w:b w:val="0"/>
+          <w:i w:val="0"/>
+          <w:sz w:val="19"/>
+        </w:rPr>
+        <w:t>vercel-overview.png</w:t>
+      </w:r>
+      <w:r>
+        <w:rPr>
+          <w:b w:val="0"/>
+          <w:i w:val="0"/>
+        </w:rPr>
+        <w:t xml:space="preserve"> | Vercel → </w:t>
+      </w:r>
+      <w:r>
+        <w:rPr>
+          <w:b/>
+          <w:i w:val="0"/>
+        </w:rPr>
+        <w:t>calculator-ai-ui</w:t>
+      </w:r>
+      <w:r>
+        <w:rPr>
+          <w:b w:val="0"/>
+          <w:i w:val="0"/>
+        </w:rPr>
+        <w:t xml:space="preserve"> → Overview | | </w:t>
+      </w:r>
+      <w:r>
+        <w:rPr>
+          <w:rFonts w:ascii="Consolas" w:hAnsi="Consolas"/>
+          <w:b w:val="0"/>
+          <w:i w:val="0"/>
+          <w:sz w:val="19"/>
+        </w:rPr>
+        <w:t>render-auth-env.png</w:t>
+      </w:r>
+      <w:r>
+        <w:rPr>
+          <w:b w:val="0"/>
+          <w:i w:val="0"/>
+        </w:rPr>
+        <w:t xml:space="preserve"> | Render → </w:t>
+      </w:r>
+      <w:r>
+        <w:rPr>
+          <w:b/>
+          <w:i w:val="0"/>
+        </w:rPr>
+        <w:t>Calculator-code-auth</w:t>
+      </w:r>
+      <w:r>
+        <w:rPr>
+          <w:b w:val="0"/>
+          <w:i w:val="0"/>
+        </w:rPr>
+        <w:t xml:space="preserve"> (Node) → Environment | | </w:t>
+      </w:r>
+      <w:r>
+        <w:rPr>
+          <w:rFonts w:ascii="Consolas" w:hAnsi="Consolas"/>
+          <w:b w:val="0"/>
+          <w:i w:val="0"/>
+          <w:sz w:val="19"/>
+        </w:rPr>
+        <w:t>vercel-env.png</w:t>
+      </w:r>
+      <w:r>
+        <w:rPr>
+          <w:b w:val="0"/>
+          <w:i w:val="0"/>
+        </w:rPr>
+        <w:t xml:space="preserve"> | Vercel → </w:t>
+      </w:r>
+      <w:r>
+        <w:rPr>
+          <w:b/>
+          <w:i w:val="0"/>
+        </w:rPr>
+        <w:t>calculator-ai-ui</w:t>
+      </w:r>
+      <w:r>
+        <w:rPr>
+          <w:b w:val="0"/>
+          <w:i w:val="0"/>
+        </w:rPr>
+        <w:t xml:space="preserve"> → Environment Variables |</w:t>
       </w:r>
     </w:p>
     <w:p>
@@ -69,139 +207,11 @@
         <w:pStyle w:val="IntenseQuote"/>
       </w:pPr>
       <w:r>
-        <w:t>| File | What it shows |</w:t>
-      </w:r>
-    </w:p>
-    <w:p>
-      <w:pPr>
-        <w:pStyle w:val="IntenseQuote"/>
-      </w:pPr>
-      <w:r>
-        <w:t>|---|---|</w:t>
-      </w:r>
-    </w:p>
-    <w:p>
-      <w:pPr>
-        <w:pStyle w:val="IntenseQuote"/>
-      </w:pPr>
-      <w:r>
-        <w:t xml:space="preserve">| </w:t>
-      </w:r>
-      <w:r>
-        <w:rPr>
-          <w:rFonts w:ascii="Consolas" w:hAnsi="Consolas"/>
-          <w:sz w:val="19"/>
-        </w:rPr>
-        <w:t>render-flask-env.png</w:t>
-      </w:r>
-      <w:r>
-        <w:t xml:space="preserve"> | Render → </w:t>
-      </w:r>
-      <w:r>
-        <w:rPr>
-          <w:b/>
-        </w:rPr>
-        <w:t>Calculator-code</w:t>
-      </w:r>
-      <w:r>
-        <w:t xml:space="preserve"> (Flask) → Environment |</w:t>
-      </w:r>
-    </w:p>
-    <w:p>
-      <w:pPr>
-        <w:pStyle w:val="IntenseQuote"/>
-      </w:pPr>
-      <w:r>
-        <w:t xml:space="preserve">| </w:t>
-      </w:r>
-      <w:r>
-        <w:rPr>
-          <w:rFonts w:ascii="Consolas" w:hAnsi="Consolas"/>
-          <w:sz w:val="19"/>
-        </w:rPr>
-        <w:t>vercel-overview.png</w:t>
-      </w:r>
-      <w:r>
-        <w:t xml:space="preserve"> | Vercel → </w:t>
-      </w:r>
-      <w:r>
-        <w:rPr>
-          <w:b/>
-        </w:rPr>
-        <w:t>calculator-ai-ui</w:t>
-      </w:r>
-      <w:r>
-        <w:t xml:space="preserve"> → Overview |</w:t>
-      </w:r>
-    </w:p>
-    <w:p>
-      <w:pPr>
-        <w:pStyle w:val="IntenseQuote"/>
-      </w:pPr>
-      <w:r>
-        <w:t xml:space="preserve">| </w:t>
-      </w:r>
-      <w:r>
-        <w:rPr>
-          <w:rFonts w:ascii="Consolas" w:hAnsi="Consolas"/>
-          <w:sz w:val="19"/>
-        </w:rPr>
-        <w:t>render-auth-env.png</w:t>
-      </w:r>
-      <w:r>
-        <w:t xml:space="preserve"> | Render → </w:t>
-      </w:r>
-      <w:r>
-        <w:rPr>
-          <w:b/>
-        </w:rPr>
-        <w:t>Calculator-code-auth</w:t>
-      </w:r>
-      <w:r>
-        <w:t xml:space="preserve"> (Node) → Environment |</w:t>
-      </w:r>
-    </w:p>
-    <w:p>
-      <w:pPr>
-        <w:pStyle w:val="IntenseQuote"/>
-      </w:pPr>
-      <w:r>
-        <w:t xml:space="preserve">| </w:t>
-      </w:r>
-      <w:r>
-        <w:rPr>
-          <w:rFonts w:ascii="Consolas" w:hAnsi="Consolas"/>
-          <w:sz w:val="19"/>
-        </w:rPr>
-        <w:t>vercel-env.png</w:t>
-      </w:r>
-      <w:r>
-        <w:t xml:space="preserve"> | Vercel → </w:t>
-      </w:r>
-      <w:r>
-        <w:rPr>
-          <w:b/>
-        </w:rPr>
-        <w:t>calculator-ai-ui</w:t>
-      </w:r>
-      <w:r>
-        <w:t xml:space="preserve"> → Environment Variables |</w:t>
-      </w:r>
-    </w:p>
-    <w:p>
-      <w:pPr>
-        <w:pStyle w:val="IntenseQuote"/>
-      </w:pPr>
-      <w:r>
-        <w:t>The captions below describe each one in full, so the doc is still complete even</w:t>
-      </w:r>
-    </w:p>
-    <w:p>
-      <w:pPr>
-        <w:pStyle w:val="IntenseQuote"/>
-      </w:pPr>
-      <w:r>
-        <w:t>before the images are dropped in.</w:t>
+        <w:rPr>
+          <w:b w:val="0"/>
+          <w:i w:val="0"/>
+        </w:rPr>
+        <w:t>The captions below describe each one in full, so the doc is still complete even before the images are dropped in.</w:t>
       </w:r>
     </w:p>
     <w:p/>
@@ -215,15 +225,24 @@
     </w:p>
     <w:p>
       <w:r>
+        <w:rPr>
+          <w:b w:val="0"/>
+          <w:i w:val="0"/>
+        </w:rPr>
         <w:t xml:space="preserve">There are </w:t>
       </w:r>
       <w:r>
         <w:rPr>
           <w:b/>
+          <w:i w:val="0"/>
         </w:rPr>
         <w:t>four</w:t>
       </w:r>
       <w:r>
+        <w:rPr>
+          <w:b w:val="0"/>
+          <w:i w:val="0"/>
+        </w:rPr>
         <w:t xml:space="preserve"> moving parts plus the git repo. Three are hosted services; one is a database.</w:t>
       </w:r>
     </w:p>
@@ -315,6 +334,7 @@
             <w:r>
               <w:rPr>
                 <w:b/>
+                <w:i w:val="0"/>
               </w:rPr>
               <w:t>Piece</w:t>
             </w:r>
@@ -328,6 +348,7 @@
             <w:r>
               <w:rPr>
                 <w:b/>
+                <w:i w:val="0"/>
               </w:rPr>
               <w:t>Tech</w:t>
             </w:r>
@@ -341,6 +362,7 @@
             <w:r>
               <w:rPr>
                 <w:b/>
+                <w:i w:val="0"/>
               </w:rPr>
               <w:t>Host</w:t>
             </w:r>
@@ -354,6 +376,7 @@
             <w:r>
               <w:rPr>
                 <w:b/>
+                <w:i w:val="0"/>
               </w:rPr>
               <w:t>In this repo</w:t>
             </w:r>
@@ -367,6 +390,7 @@
             <w:r>
               <w:rPr>
                 <w:b/>
+                <w:i w:val="0"/>
               </w:rPr>
               <w:t>Public URL</w:t>
             </w:r>
@@ -382,6 +406,7 @@
             <w:r>
               <w:rPr>
                 <w:b/>
+                <w:i w:val="0"/>
               </w:rPr>
               <w:t>Frontend UI</w:t>
             </w:r>
@@ -393,6 +418,10 @@
           </w:tcPr>
           <w:p>
             <w:r>
+              <w:rPr>
+                <w:b w:val="0"/>
+                <w:i w:val="0"/>
+              </w:rPr>
               <w:t>React (create-react-app)</w:t>
             </w:r>
           </w:p>
@@ -405,20 +434,31 @@
             <w:r>
               <w:rPr>
                 <w:b/>
+                <w:i w:val="0"/>
               </w:rPr>
               <w:t>Vercel</w:t>
             </w:r>
             <w:r>
+              <w:rPr>
+                <w:b w:val="0"/>
+                <w:i w:val="0"/>
+              </w:rPr>
               <w:t xml:space="preserve"> (</w:t>
             </w:r>
             <w:r>
               <w:rPr>
                 <w:rFonts w:ascii="Consolas" w:hAnsi="Consolas"/>
+                <w:b w:val="0"/>
+                <w:i w:val="0"/>
                 <w:sz w:val="19"/>
               </w:rPr>
               <w:t>calculator-ai-ui</w:t>
             </w:r>
             <w:r>
+              <w:rPr>
+                <w:b w:val="0"/>
+                <w:i w:val="0"/>
+              </w:rPr>
               <w:t>)</w:t>
             </w:r>
           </w:p>
@@ -447,21 +487,33 @@
             <w:r>
               <w:rPr>
                 <w:rFonts w:ascii="Consolas" w:hAnsi="Consolas"/>
+                <w:b w:val="0"/>
+                <w:i w:val="0"/>
                 <w:sz w:val="19"/>
               </w:rPr>
               <w:t>app.cloudforlawfirms.com</w:t>
             </w:r>
             <w:r>
+              <w:rPr>
+                <w:b w:val="0"/>
+                <w:i w:val="0"/>
+              </w:rPr>
               <w:t xml:space="preserve"> (+ </w:t>
             </w:r>
             <w:r>
               <w:rPr>
                 <w:rFonts w:ascii="Consolas" w:hAnsi="Consolas"/>
+                <w:b w:val="0"/>
+                <w:i w:val="0"/>
                 <w:sz w:val="19"/>
               </w:rPr>
               <w:t>calculator-ai-ui.vercel.app</w:t>
             </w:r>
             <w:r>
+              <w:rPr>
+                <w:b w:val="0"/>
+                <w:i w:val="0"/>
+              </w:rPr>
               <w:t>)</w:t>
             </w:r>
           </w:p>
@@ -476,6 +528,7 @@
             <w:r>
               <w:rPr>
                 <w:b/>
+                <w:i w:val="0"/>
               </w:rPr>
               <w:t>Auth + data API</w:t>
             </w:r>
@@ -487,6 +540,10 @@
           </w:tcPr>
           <w:p>
             <w:r>
+              <w:rPr>
+                <w:b w:val="0"/>
+                <w:i w:val="0"/>
+              </w:rPr>
               <w:t>Node.js / Express 5 / Prisma</w:t>
             </w:r>
           </w:p>
@@ -499,20 +556,31 @@
             <w:r>
               <w:rPr>
                 <w:b/>
+                <w:i w:val="0"/>
               </w:rPr>
               <w:t>Render</w:t>
             </w:r>
             <w:r>
+              <w:rPr>
+                <w:b w:val="0"/>
+                <w:i w:val="0"/>
+              </w:rPr>
               <w:t xml:space="preserve"> (</w:t>
             </w:r>
             <w:r>
               <w:rPr>
                 <w:rFonts w:ascii="Consolas" w:hAnsi="Consolas"/>
+                <w:b w:val="0"/>
+                <w:i w:val="0"/>
                 <w:sz w:val="19"/>
               </w:rPr>
               <w:t>Calculator-code-auth</w:t>
             </w:r>
             <w:r>
+              <w:rPr>
+                <w:b w:val="0"/>
+                <w:i w:val="0"/>
+              </w:rPr>
               <w:t>)</w:t>
             </w:r>
           </w:p>
@@ -541,6 +609,8 @@
             <w:r>
               <w:rPr>
                 <w:rFonts w:ascii="Consolas" w:hAnsi="Consolas"/>
+                <w:b w:val="0"/>
+                <w:i w:val="0"/>
                 <w:sz w:val="19"/>
               </w:rPr>
               <w:t>calculator-code-auth.onrender.com</w:t>
@@ -557,6 +627,7 @@
             <w:r>
               <w:rPr>
                 <w:b/>
+                <w:i w:val="0"/>
               </w:rPr>
               <w:t>AI / report backend</w:t>
             </w:r>
@@ -568,6 +639,10 @@
           </w:tcPr>
           <w:p>
             <w:r>
+              <w:rPr>
+                <w:b w:val="0"/>
+                <w:i w:val="0"/>
+              </w:rPr>
               <w:t>Python / Flask / gunicorn</w:t>
             </w:r>
           </w:p>
@@ -580,20 +655,31 @@
             <w:r>
               <w:rPr>
                 <w:b/>
+                <w:i w:val="0"/>
               </w:rPr>
               <w:t>Render</w:t>
             </w:r>
             <w:r>
+              <w:rPr>
+                <w:b w:val="0"/>
+                <w:i w:val="0"/>
+              </w:rPr>
               <w:t xml:space="preserve"> (</w:t>
             </w:r>
             <w:r>
               <w:rPr>
                 <w:rFonts w:ascii="Consolas" w:hAnsi="Consolas"/>
+                <w:b w:val="0"/>
+                <w:i w:val="0"/>
                 <w:sz w:val="19"/>
               </w:rPr>
               <w:t>Calculator-code</w:t>
             </w:r>
             <w:r>
+              <w:rPr>
+                <w:b w:val="0"/>
+                <w:i w:val="0"/>
+              </w:rPr>
               <w:t>)</w:t>
             </w:r>
           </w:p>
@@ -613,6 +699,10 @@
               </w:r>
             </w:hyperlink>
             <w:r>
+              <w:rPr>
+                <w:b w:val="0"/>
+                <w:i w:val="0"/>
+              </w:rPr>
               <w:t xml:space="preserve"> + calculators</w:t>
             </w:r>
           </w:p>
@@ -625,6 +715,8 @@
             <w:r>
               <w:rPr>
                 <w:rFonts w:ascii="Consolas" w:hAnsi="Consolas"/>
+                <w:b w:val="0"/>
+                <w:i w:val="0"/>
                 <w:sz w:val="19"/>
               </w:rPr>
               <w:t>calculator-code-x2b4.onrender.com</w:t>
@@ -641,6 +733,7 @@
             <w:r>
               <w:rPr>
                 <w:b/>
+                <w:i w:val="0"/>
               </w:rPr>
               <w:t>Database</w:t>
             </w:r>
@@ -652,6 +745,10 @@
           </w:tcPr>
           <w:p>
             <w:r>
+              <w:rPr>
+                <w:b w:val="0"/>
+                <w:i w:val="0"/>
+              </w:rPr>
               <w:t>PostgreSQL</w:t>
             </w:r>
           </w:p>
@@ -664,6 +761,7 @@
             <w:r>
               <w:rPr>
                 <w:b/>
+                <w:i w:val="0"/>
               </w:rPr>
               <w:t>AWS RDS</w:t>
             </w:r>
@@ -675,6 +773,10 @@
           </w:tcPr>
           <w:p>
             <w:r>
+              <w:rPr>
+                <w:b w:val="0"/>
+                <w:i w:val="0"/>
+              </w:rPr>
               <w:t xml:space="preserve">schema in </w:t>
             </w:r>
             <w:hyperlink r:id="rId13">
@@ -694,16 +796,26 @@
           </w:tcPr>
           <w:p>
             <w:r>
+              <w:rPr>
+                <w:b w:val="0"/>
+                <w:i w:val="0"/>
+              </w:rPr>
               <w:t xml:space="preserve">(private, via </w:t>
             </w:r>
             <w:r>
               <w:rPr>
                 <w:rFonts w:ascii="Consolas" w:hAnsi="Consolas"/>
+                <w:b w:val="0"/>
+                <w:i w:val="0"/>
                 <w:sz w:val="19"/>
               </w:rPr>
               <w:t>DATABASE_URL</w:t>
             </w:r>
             <w:r>
+              <w:rPr>
+                <w:b w:val="0"/>
+                <w:i w:val="0"/>
+              </w:rPr>
               <w:t>)</w:t>
             </w:r>
           </w:p>
@@ -713,40 +825,67 @@
     <w:p/>
     <w:p>
       <w:r>
+        <w:rPr>
+          <w:b w:val="0"/>
+          <w:i w:val="0"/>
+        </w:rPr>
         <w:t xml:space="preserve">Everything deploys off the </w:t>
       </w:r>
       <w:r>
         <w:rPr>
+          <w:rFonts w:ascii="Consolas" w:hAnsi="Consolas"/>
           <w:b/>
-        </w:rPr>
-        <w:t>`main`</w:t>
-      </w:r>
-      <w:r>
+          <w:i w:val="0"/>
+          <w:sz w:val="19"/>
+        </w:rPr>
+        <w:t>main</w:t>
+      </w:r>
+      <w:r>
+        <w:rPr>
+          <w:b w:val="0"/>
+          <w:i w:val="0"/>
+        </w:rPr>
         <w:t xml:space="preserve"> branch of </w:t>
       </w:r>
       <w:r>
         <w:rPr>
           <w:rFonts w:ascii="Consolas" w:hAnsi="Consolas"/>
+          <w:b w:val="0"/>
+          <w:i w:val="0"/>
           <w:sz w:val="19"/>
         </w:rPr>
         <w:t>cloudactai/Calculator-code</w:t>
       </w:r>
       <w:r>
+        <w:rPr>
+          <w:b w:val="0"/>
+          <w:i w:val="0"/>
+        </w:rPr>
         <w:t>. In the screenshots all three services are on the same commit (</w:t>
       </w:r>
       <w:r>
         <w:rPr>
           <w:rFonts w:ascii="Consolas" w:hAnsi="Consolas"/>
+          <w:b w:val="0"/>
+          <w:i w:val="0"/>
           <w:sz w:val="19"/>
         </w:rPr>
         <w:t>e6e814b</w:t>
       </w:r>
       <w:r>
+        <w:rPr>
+          <w:b w:val="0"/>
+          <w:i w:val="0"/>
+        </w:rPr>
         <w:t>, "Merge pull request</w:t>
       </w:r>
     </w:p>
     <w:p>
       <w:r>
+        <w:rPr>
+          <w:b w:val="0"/>
+          <w:i w:val="0"/>
+        </w:rPr>
         <w:t>#58 from cloudactai/marc"), which is what "everything is in sync" looks like.</w:t>
       </w:r>
     </w:p>
@@ -812,6 +951,10 @@
     </w:p>
     <w:p>
       <w:r>
+        <w:rPr>
+          <w:b w:val="0"/>
+          <w:i w:val="0"/>
+        </w:rPr>
         <w:t xml:space="preserve">The React SPA (built from </w:t>
       </w:r>
       <w:hyperlink r:id="rId10">
@@ -824,6 +967,10 @@
         </w:r>
       </w:hyperlink>
       <w:r>
+        <w:rPr>
+          <w:b w:val="0"/>
+          <w:i w:val="0"/>
+        </w:rPr>
         <w:t>). It's the CloudAct Solutions sign-in + the whole app the lawyer uses (Matters, Forms, calculators). Key facts from the Overview screenshot:</w:t>
       </w:r>
     </w:p>
@@ -834,29 +981,45 @@
       <w:r>
         <w:rPr>
           <w:b/>
+          <w:i w:val="0"/>
         </w:rPr>
         <w:t>Project:</w:t>
       </w:r>
       <w:r>
+        <w:rPr>
+          <w:b w:val="0"/>
+          <w:i w:val="0"/>
+        </w:rPr>
         <w:t xml:space="preserve"> </w:t>
       </w:r>
       <w:r>
         <w:rPr>
           <w:rFonts w:ascii="Consolas" w:hAnsi="Consolas"/>
+          <w:b w:val="0"/>
+          <w:i w:val="0"/>
           <w:sz w:val="19"/>
         </w:rPr>
         <w:t>calculator-ai-ui</w:t>
       </w:r>
       <w:r>
+        <w:rPr>
+          <w:b w:val="0"/>
+          <w:i w:val="0"/>
+        </w:rPr>
         <w:t xml:space="preserve"> under the </w:t>
       </w:r>
       <w:r>
         <w:rPr>
           <w:b/>
+          <w:i w:val="0"/>
         </w:rPr>
         <w:t>CloudactAi</w:t>
       </w:r>
       <w:r>
+        <w:rPr>
+          <w:b w:val="0"/>
+          <w:i w:val="0"/>
+        </w:rPr>
         <w:t xml:space="preserve"> Vercel team (Hobby plan).</w:t>
       </w:r>
     </w:p>
@@ -867,33 +1030,48 @@
       <w:r>
         <w:rPr>
           <w:b/>
+          <w:i w:val="0"/>
         </w:rPr>
         <w:t>Production domain:</w:t>
       </w:r>
       <w:r>
+        <w:rPr>
+          <w:b w:val="0"/>
+          <w:i w:val="0"/>
+        </w:rPr>
         <w:t xml:space="preserve"> </w:t>
       </w:r>
       <w:r>
         <w:rPr>
           <w:rFonts w:ascii="Consolas" w:hAnsi="Consolas"/>
+          <w:b w:val="0"/>
+          <w:i w:val="0"/>
           <w:sz w:val="19"/>
         </w:rPr>
         <w:t>app.cloudforlawfirms.com</w:t>
       </w:r>
       <w:r>
+        <w:rPr>
+          <w:b w:val="0"/>
+          <w:i w:val="0"/>
+        </w:rPr>
         <w:t xml:space="preserve"> (with </w:t>
       </w:r>
       <w:r>
         <w:rPr>
           <w:rFonts w:ascii="Consolas" w:hAnsi="Consolas"/>
+          <w:b w:val="0"/>
+          <w:i w:val="0"/>
           <w:sz w:val="19"/>
         </w:rPr>
         <w:t>calculator-ai-ui.vercel.app</w:t>
       </w:r>
-    </w:p>
-    <w:p>
-      <w:r>
-        <w:t>as the Vercel-generated alias).</w:t>
+      <w:r>
+        <w:rPr>
+          <w:b w:val="0"/>
+          <w:i w:val="0"/>
+        </w:rPr>
+        <w:t xml:space="preserve"> as the Vercel-generated alias).</w:t>
       </w:r>
     </w:p>
     <w:p>
@@ -903,16 +1081,25 @@
       <w:r>
         <w:rPr>
           <w:b/>
-        </w:rPr>
-        <w:t>Deploys on push to `main`</w:t>
-      </w:r>
-      <w:r>
-        <w:t xml:space="preserve"> — "To update your Production Deployment, push to the</w:t>
-      </w:r>
-    </w:p>
-    <w:p>
-      <w:r>
-        <w:t>main branch." Each merged PR triggers a build.</w:t>
+          <w:i w:val="0"/>
+        </w:rPr>
+        <w:t xml:space="preserve">Deploys on push to </w:t>
+      </w:r>
+      <w:r>
+        <w:rPr>
+          <w:rFonts w:ascii="Consolas" w:hAnsi="Consolas"/>
+          <w:b/>
+          <w:i w:val="0"/>
+          <w:sz w:val="19"/>
+        </w:rPr>
+        <w:t>main</w:t>
+      </w:r>
+      <w:r>
+        <w:rPr>
+          <w:b w:val="0"/>
+          <w:i w:val="0"/>
+        </w:rPr>
+        <w:t xml:space="preserve"> — "To update your Production Deployment, push to the main branch." Each merged PR triggers a build.</w:t>
       </w:r>
     </w:p>
     <w:p>
@@ -920,45 +1107,68 @@
         <w:pStyle w:val="ListBullet"/>
       </w:pPr>
       <w:r>
+        <w:rPr>
+          <w:b w:val="0"/>
+          <w:i w:val="0"/>
+        </w:rPr>
         <w:t xml:space="preserve">It's a </w:t>
       </w:r>
       <w:r>
         <w:rPr>
           <w:b/>
+          <w:i w:val="0"/>
         </w:rPr>
         <w:t>create-react-app</w:t>
       </w:r>
       <w:r>
-        <w:t xml:space="preserve"> build, not Vite. This matters: env vars are</w:t>
-      </w:r>
-    </w:p>
-    <w:p>
+        <w:rPr>
+          <w:b w:val="0"/>
+          <w:i w:val="0"/>
+        </w:rPr>
+        <w:t xml:space="preserve"> build, not Vite. This matters: env vars are </w:t>
+      </w:r>
       <w:r>
         <w:rPr>
           <w:rFonts w:ascii="Consolas" w:hAnsi="Consolas"/>
+          <w:b w:val="0"/>
+          <w:i w:val="0"/>
           <w:sz w:val="19"/>
         </w:rPr>
         <w:t>process.env.REACT_APP_*</w:t>
       </w:r>
       <w:r>
+        <w:rPr>
+          <w:b w:val="0"/>
+          <w:i w:val="0"/>
+        </w:rPr>
         <w:t xml:space="preserve">, inlined </w:t>
       </w:r>
       <w:r>
         <w:rPr>
           <w:b/>
+          <w:i w:val="0"/>
         </w:rPr>
         <w:t>at build time</w:t>
       </w:r>
       <w:r>
+        <w:rPr>
+          <w:b w:val="0"/>
+          <w:i w:val="0"/>
+        </w:rPr>
         <w:t xml:space="preserve">. Changing an env var in Vercel does nothing until you </w:t>
       </w:r>
       <w:r>
         <w:rPr>
           <w:b/>
+          <w:i w:val="0"/>
         </w:rPr>
         <w:t>redeploy</w:t>
       </w:r>
       <w:r>
+        <w:rPr>
+          <w:b w:val="0"/>
+          <w:i w:val="0"/>
+        </w:rPr>
         <w:t>.</w:t>
       </w:r>
     </w:p>
@@ -967,6 +1177,10 @@
         <w:pStyle w:val="ListBullet"/>
       </w:pPr>
       <w:r>
+        <w:rPr>
+          <w:b w:val="0"/>
+          <w:i w:val="0"/>
+        </w:rPr>
         <w:t xml:space="preserve">SPA routing is handled by </w:t>
       </w:r>
       <w:hyperlink r:id="rId15">
@@ -979,18 +1193,26 @@
         </w:r>
       </w:hyperlink>
       <w:r>
-        <w:t>, which rewrites every path to</w:t>
-      </w:r>
-    </w:p>
-    <w:p>
+        <w:rPr>
+          <w:b w:val="0"/>
+          <w:i w:val="0"/>
+        </w:rPr>
+        <w:t xml:space="preserve">, which rewrites every path to </w:t>
+      </w:r>
       <w:r>
         <w:rPr>
           <w:rFonts w:ascii="Consolas" w:hAnsi="Consolas"/>
+          <w:b w:val="0"/>
+          <w:i w:val="0"/>
           <w:sz w:val="19"/>
         </w:rPr>
         <w:t>/index.html</w:t>
       </w:r>
       <w:r>
+        <w:rPr>
+          <w:b w:val="0"/>
+          <w:i w:val="0"/>
+        </w:rPr>
         <w:t xml:space="preserve"> so client-side React Router works on refresh.</w:t>
       </w:r>
     </w:p>
@@ -1001,27 +1223,16 @@
       <w:r>
         <w:rPr>
           <w:b/>
+          <w:i w:val="0"/>
         </w:rPr>
         <w:t>Hobby-plan deploy quirk:</w:t>
       </w:r>
       <w:r>
-        <w:t xml:space="preserve"> only commits by the account owner auto-deploy. If a</w:t>
-      </w:r>
-    </w:p>
-    <w:p>
-      <w:pPr>
-        <w:pStyle w:val="IntenseQuote"/>
-      </w:pPr>
-      <w:r>
-        <w:t>teammate's merge doesn't deploy ("commit author does not have contributing access"),</w:t>
-      </w:r>
-    </w:p>
-    <w:p>
-      <w:pPr>
-        <w:pStyle w:val="IntenseQuote"/>
-      </w:pPr>
-      <w:r>
-        <w:t>the owner has to push/redeploy, or the team upgrades to Pro.</w:t>
+        <w:rPr>
+          <w:b w:val="0"/>
+          <w:i w:val="0"/>
+        </w:rPr>
+        <w:t xml:space="preserve"> only commits by the account owner auto-deploy. If a teammate's merge doesn't deploy ("commit author does not have contributing access"), the owner has to push/redeploy, or the team upgrades to Pro.</w:t>
       </w:r>
     </w:p>
     <w:p>
@@ -1085,6 +1296,10 @@
     </w:p>
     <w:p>
       <w:r>
+        <w:rPr>
+          <w:b w:val="0"/>
+          <w:i w:val="0"/>
+        </w:rPr>
         <w:t xml:space="preserve">Only two are set (screenshot 4), and that's by design — the frontend has smart defaults in </w:t>
       </w:r>
       <w:hyperlink r:id="rId17">
@@ -1097,6 +1312,10 @@
         </w:r>
       </w:hyperlink>
       <w:r>
+        <w:rPr>
+          <w:b w:val="0"/>
+          <w:i w:val="0"/>
+        </w:rPr>
         <w:t xml:space="preserve"> and </w:t>
       </w:r>
       <w:hyperlink r:id="rId18">
@@ -1109,6 +1328,10 @@
         </w:r>
       </w:hyperlink>
       <w:r>
+        <w:rPr>
+          <w:b w:val="0"/>
+          <w:i w:val="0"/>
+        </w:rPr>
         <w:t>:</w:t>
       </w:r>
     </w:p>
@@ -1131,6 +1354,7 @@
             <w:r>
               <w:rPr>
                 <w:b/>
+                <w:i w:val="0"/>
               </w:rPr>
               <w:t>Variable</w:t>
             </w:r>
@@ -1144,6 +1368,7 @@
             <w:r>
               <w:rPr>
                 <w:b/>
+                <w:i w:val="0"/>
               </w:rPr>
               <w:t>Purpose</w:t>
             </w:r>
@@ -1159,6 +1384,8 @@
             <w:r>
               <w:rPr>
                 <w:rFonts w:ascii="Consolas" w:hAnsi="Consolas"/>
+                <w:b w:val="0"/>
+                <w:i w:val="0"/>
                 <w:sz w:val="19"/>
               </w:rPr>
               <w:t>REACT_APP_API_BASE_URL</w:t>
@@ -1171,55 +1398,88 @@
           </w:tcPr>
           <w:p>
             <w:r>
+              <w:rPr>
+                <w:b w:val="0"/>
+                <w:i w:val="0"/>
+              </w:rPr>
               <w:t xml:space="preserve">Base URL of the </w:t>
             </w:r>
             <w:r>
               <w:rPr>
                 <w:b/>
+                <w:i w:val="0"/>
               </w:rPr>
               <w:t>auth-server</w:t>
             </w:r>
             <w:r>
+              <w:rPr>
+                <w:b w:val="0"/>
+                <w:i w:val="0"/>
+              </w:rPr>
               <w:t xml:space="preserve"> (the Node service). Everything the app loads/saves — login, matters, forms, folders, task states — goes here. </w:t>
             </w:r>
             <w:r>
               <w:rPr>
                 <w:rFonts w:ascii="Consolas" w:hAnsi="Consolas"/>
+                <w:b w:val="0"/>
+                <w:i w:val="0"/>
                 <w:sz w:val="19"/>
               </w:rPr>
               <w:t>dataAxios.js</w:t>
             </w:r>
             <w:r>
+              <w:rPr>
+                <w:b w:val="0"/>
+                <w:i w:val="0"/>
+              </w:rPr>
               <w:t xml:space="preserve"> normalizes it to the </w:t>
             </w:r>
             <w:r>
               <w:rPr>
                 <w:rFonts w:ascii="Consolas" w:hAnsi="Consolas"/>
+                <w:b w:val="0"/>
+                <w:i w:val="0"/>
                 <w:sz w:val="19"/>
               </w:rPr>
               <w:t>/v1</w:t>
             </w:r>
             <w:r>
+              <w:rPr>
+                <w:b w:val="0"/>
+                <w:i w:val="0"/>
+              </w:rPr>
               <w:t xml:space="preserve"> data API and the same host serves </w:t>
             </w:r>
             <w:r>
               <w:rPr>
                 <w:rFonts w:ascii="Consolas" w:hAnsi="Consolas"/>
+                <w:b w:val="0"/>
+                <w:i w:val="0"/>
                 <w:sz w:val="19"/>
               </w:rPr>
               <w:t>/api/*</w:t>
             </w:r>
             <w:r>
+              <w:rPr>
+                <w:b w:val="0"/>
+                <w:i w:val="0"/>
+              </w:rPr>
               <w:t xml:space="preserve"> for auth. If unset in production it falls back to </w:t>
             </w:r>
             <w:r>
               <w:rPr>
                 <w:rFonts w:ascii="Consolas" w:hAnsi="Consolas"/>
+                <w:b w:val="0"/>
+                <w:i w:val="0"/>
                 <w:sz w:val="19"/>
               </w:rPr>
               <w:t>https://calculator-code-auth.onrender.com/v1</w:t>
             </w:r>
             <w:r>
+              <w:rPr>
+                <w:b w:val="0"/>
+                <w:i w:val="0"/>
+              </w:rPr>
               <w:t>.</w:t>
             </w:r>
           </w:p>
@@ -1234,6 +1494,8 @@
             <w:r>
               <w:rPr>
                 <w:rFonts w:ascii="Consolas" w:hAnsi="Consolas"/>
+                <w:b w:val="0"/>
+                <w:i w:val="0"/>
                 <w:sz w:val="19"/>
               </w:rPr>
               <w:t>REACT_APP_ENVIRONMENT</w:t>
@@ -1246,56 +1508,104 @@
           </w:tcPr>
           <w:p>
             <w:r>
+              <w:rPr>
+                <w:b w:val="0"/>
+                <w:i w:val="0"/>
+              </w:rPr>
               <w:t xml:space="preserve">Build environment tag: </w:t>
             </w:r>
             <w:r>
               <w:rPr>
                 <w:rFonts w:ascii="Consolas" w:hAnsi="Consolas"/>
+                <w:b w:val="0"/>
+                <w:i w:val="0"/>
                 <w:sz w:val="19"/>
               </w:rPr>
               <w:t>DEV</w:t>
             </w:r>
             <w:r>
+              <w:rPr>
+                <w:b w:val="0"/>
+                <w:i w:val="0"/>
+              </w:rPr>
               <w:t xml:space="preserve"> / </w:t>
             </w:r>
             <w:r>
               <w:rPr>
                 <w:rFonts w:ascii="Consolas" w:hAnsi="Consolas"/>
+                <w:b w:val="0"/>
+                <w:i w:val="0"/>
                 <w:sz w:val="19"/>
               </w:rPr>
               <w:t>QA</w:t>
             </w:r>
             <w:r>
+              <w:rPr>
+                <w:b w:val="0"/>
+                <w:i w:val="0"/>
+              </w:rPr>
               <w:t xml:space="preserve"> / </w:t>
             </w:r>
             <w:r>
               <w:rPr>
                 <w:rFonts w:ascii="Consolas" w:hAnsi="Consolas"/>
+                <w:b w:val="0"/>
+                <w:i w:val="0"/>
                 <w:sz w:val="19"/>
               </w:rPr>
               <w:t>PROD</w:t>
             </w:r>
             <w:r>
+              <w:rPr>
+                <w:b w:val="0"/>
+                <w:i w:val="0"/>
+              </w:rPr>
               <w:t xml:space="preserve"> / </w:t>
             </w:r>
             <w:r>
               <w:rPr>
                 <w:rFonts w:ascii="Consolas" w:hAnsi="Consolas"/>
+                <w:b w:val="0"/>
+                <w:i w:val="0"/>
                 <w:sz w:val="19"/>
               </w:rPr>
               <w:t>LOCAL</w:t>
             </w:r>
             <w:r>
-              <w:t xml:space="preserve"> (marked *Sensitive*). Read in </w:t>
+              <w:rPr>
+                <w:b w:val="0"/>
+                <w:i w:val="0"/>
+              </w:rPr>
+              <w:t xml:space="preserve"> (marked </w:t>
+            </w:r>
+            <w:r>
+              <w:rPr>
+                <w:b w:val="0"/>
+                <w:i/>
+              </w:rPr>
+              <w:t>Sensitive</w:t>
+            </w:r>
+            <w:r>
+              <w:rPr>
+                <w:b w:val="0"/>
+                <w:i w:val="0"/>
+              </w:rPr>
+              <w:t xml:space="preserve">). Read in </w:t>
             </w:r>
             <w:r>
               <w:rPr>
                 <w:rFonts w:ascii="Consolas" w:hAnsi="Consolas"/>
+                <w:b w:val="0"/>
+                <w:i w:val="0"/>
                 <w:sz w:val="19"/>
               </w:rPr>
               <w:t>config.ts</w:t>
             </w:r>
             <w:r>
+              <w:rPr>
+                <w:b w:val="0"/>
+                <w:i w:val="0"/>
+              </w:rPr>
               <w:t>; selects which environment profile the app assumes.</w:t>
             </w:r>
           </w:p>
@@ -1305,25 +1615,40 @@
     <w:p/>
     <w:p>
       <w:r>
+        <w:rPr>
+          <w:b w:val="0"/>
+          <w:i w:val="0"/>
+        </w:rPr>
         <w:t xml:space="preserve">Two more that are </w:t>
       </w:r>
       <w:r>
         <w:rPr>
           <w:b/>
+          <w:i w:val="0"/>
         </w:rPr>
         <w:t>not</w:t>
       </w:r>
       <w:r>
+        <w:rPr>
+          <w:b w:val="0"/>
+          <w:i w:val="0"/>
+        </w:rPr>
         <w:t xml:space="preserve"> set here but exist as optional overrides in </w:t>
       </w:r>
       <w:r>
         <w:rPr>
           <w:rFonts w:ascii="Consolas" w:hAnsi="Consolas"/>
+          <w:b w:val="0"/>
+          <w:i w:val="0"/>
           <w:sz w:val="19"/>
         </w:rPr>
         <w:t>config.ts</w:t>
       </w:r>
       <w:r>
+        <w:rPr>
+          <w:b w:val="0"/>
+          <w:i w:val="0"/>
+        </w:rPr>
         <w:t>:</w:t>
       </w:r>
     </w:p>
@@ -1334,45 +1659,63 @@
       <w:r>
         <w:rPr>
           <w:rFonts w:ascii="Consolas" w:hAnsi="Consolas"/>
+          <w:b w:val="0"/>
+          <w:i w:val="0"/>
           <w:sz w:val="19"/>
         </w:rPr>
         <w:t>REACT_APP_CALCULATOR_API_URL</w:t>
       </w:r>
       <w:r>
+        <w:rPr>
+          <w:b w:val="0"/>
+          <w:i w:val="0"/>
+        </w:rPr>
         <w:t xml:space="preserve"> → the </w:t>
       </w:r>
       <w:r>
         <w:rPr>
           <w:b/>
+          <w:i w:val="0"/>
         </w:rPr>
         <w:t>Flask</w:t>
       </w:r>
       <w:r>
-        <w:t xml:space="preserve"> backend. Unset, so it uses the baked-in</w:t>
-      </w:r>
-    </w:p>
-    <w:p>
-      <w:r>
-        <w:t xml:space="preserve">default </w:t>
+        <w:rPr>
+          <w:b w:val="0"/>
+          <w:i w:val="0"/>
+        </w:rPr>
+        <w:t xml:space="preserve"> backend. Unset, so it uses the baked-in default </w:t>
       </w:r>
       <w:r>
         <w:rPr>
           <w:rFonts w:ascii="Consolas" w:hAnsi="Consolas"/>
+          <w:b w:val="0"/>
+          <w:i w:val="0"/>
           <w:sz w:val="19"/>
         </w:rPr>
         <w:t>https://calculator-code-x2b4.onrender.com</w:t>
       </w:r>
       <w:r>
+        <w:rPr>
+          <w:b w:val="0"/>
+          <w:i w:val="0"/>
+        </w:rPr>
         <w:t xml:space="preserve">. This is the </w:t>
       </w:r>
       <w:r>
         <w:rPr>
           <w:rFonts w:ascii="Consolas" w:hAnsi="Consolas"/>
+          <w:b w:val="0"/>
+          <w:i w:val="0"/>
           <w:sz w:val="19"/>
         </w:rPr>
         <w:t>CALCULATOR_API</w:t>
       </w:r>
       <w:r>
+        <w:rPr>
+          <w:b w:val="0"/>
+          <w:i w:val="0"/>
+        </w:rPr>
         <w:t xml:space="preserve"> the AI chat panels and report download use.</w:t>
       </w:r>
     </w:p>
@@ -1383,26 +1726,33 @@
       <w:r>
         <w:rPr>
           <w:rFonts w:ascii="Consolas" w:hAnsi="Consolas"/>
+          <w:b w:val="0"/>
+          <w:i w:val="0"/>
           <w:sz w:val="19"/>
         </w:rPr>
         <w:t>REACT_APP_SETUP_WIZARD_API_URL</w:t>
       </w:r>
       <w:r>
-        <w:t xml:space="preserve"> → a legacy Report-Creation Node backend</w:t>
-      </w:r>
-    </w:p>
-    <w:p>
-      <w:r>
-        <w:t>(</w:t>
+        <w:rPr>
+          <w:b w:val="0"/>
+          <w:i w:val="0"/>
+        </w:rPr>
+        <w:t xml:space="preserve"> → a legacy Report-Creation Node backend (</w:t>
       </w:r>
       <w:r>
         <w:rPr>
           <w:rFonts w:ascii="Consolas" w:hAnsi="Consolas"/>
+          <w:b w:val="0"/>
+          <w:i w:val="0"/>
           <w:sz w:val="19"/>
         </w:rPr>
         <w:t>report-creation.onrender.com</w:t>
       </w:r>
       <w:r>
+        <w:rPr>
+          <w:b w:val="0"/>
+          <w:i w:val="0"/>
+        </w:rPr>
         <w:t>), only used by the setup wizard.</w:t>
       </w:r>
     </w:p>
@@ -1413,17 +1763,17 @@
       <w:r>
         <w:rPr>
           <w:b/>
+          <w:i w:val="0"/>
         </w:rPr>
         <w:t>Doc mismatch to be aware of:</w:t>
       </w:r>
       <w:r>
-        <w:t xml:space="preserve"> the older handoff doc</w:t>
-      </w:r>
-    </w:p>
-    <w:p>
-      <w:pPr>
-        <w:pStyle w:val="IntenseQuote"/>
-      </w:pPr>
+        <w:rPr>
+          <w:b w:val="0"/>
+          <w:i w:val="0"/>
+        </w:rPr>
+        <w:t xml:space="preserve"> the older handoff doc </w:t>
+      </w:r>
       <w:hyperlink r:id="rId19">
         <w:r>
           <w:rPr>
@@ -1434,69 +1784,85 @@
         </w:r>
       </w:hyperlink>
       <w:r>
+        <w:rPr>
+          <w:b w:val="0"/>
+          <w:i w:val="0"/>
+        </w:rPr>
         <w:t xml:space="preserve"> talks about </w:t>
       </w:r>
       <w:r>
         <w:rPr>
           <w:rFonts w:ascii="Consolas" w:hAnsi="Consolas"/>
+          <w:b w:val="0"/>
+          <w:i w:val="0"/>
           <w:sz w:val="19"/>
         </w:rPr>
         <w:t>VITE_*</w:t>
       </w:r>
       <w:r>
-        <w:t xml:space="preserve"> variables</w:t>
-      </w:r>
-    </w:p>
-    <w:p>
-      <w:pPr>
-        <w:pStyle w:val="IntenseQuote"/>
-      </w:pPr>
-      <w:r>
-        <w:t>and "Render Postgres." That was written for a Vite build against a Render database.</w:t>
-      </w:r>
-    </w:p>
-    <w:p>
-      <w:pPr>
-        <w:pStyle w:val="IntenseQuote"/>
-      </w:pPr>
-      <w:r>
-        <w:t xml:space="preserve">The </w:t>
+        <w:rPr>
+          <w:b w:val="0"/>
+          <w:i w:val="0"/>
+        </w:rPr>
+        <w:t xml:space="preserve"> variables and "Render Postgres." That was written for a Vite build against a Render database. The </w:t>
       </w:r>
       <w:r>
         <w:rPr>
           <w:b/>
+          <w:i w:val="0"/>
         </w:rPr>
         <w:t>current</w:t>
       </w:r>
       <w:r>
-        <w:t xml:space="preserve"> app uses **CRA (</w:t>
+        <w:rPr>
+          <w:b w:val="0"/>
+          <w:i w:val="0"/>
+        </w:rPr>
+        <w:t xml:space="preserve"> app uses </w:t>
+      </w:r>
+      <w:r>
+        <w:rPr>
+          <w:b/>
+          <w:i w:val="0"/>
+        </w:rPr>
+        <w:t>CRA (</w:t>
       </w:r>
       <w:r>
         <w:rPr>
           <w:rFonts w:ascii="Consolas" w:hAnsi="Consolas"/>
+          <w:b/>
+          <w:i w:val="0"/>
           <w:sz w:val="19"/>
         </w:rPr>
         <w:t>REACT_APP_*</w:t>
       </w:r>
       <w:r>
+        <w:rPr>
+          <w:b/>
+          <w:i w:val="0"/>
+        </w:rPr>
         <w:t>)</w:t>
       </w:r>
       <w:r>
         <w:rPr>
+          <w:b w:val="0"/>
+          <w:i w:val="0"/>
+        </w:rPr>
+        <w:t xml:space="preserve"> and an </w:t>
+      </w:r>
+      <w:r>
+        <w:rPr>
           <w:b/>
-        </w:rPr>
-        <w:t xml:space="preserve"> and an </w:t>
-      </w:r>
-      <w:r>
-        <w:t>AWS** database. Trust this</w:t>
-      </w:r>
-    </w:p>
-    <w:p>
-      <w:pPr>
-        <w:pStyle w:val="IntenseQuote"/>
-      </w:pPr>
-      <w:r>
-        <w:t>doc and the screenshots over the Vite references.</w:t>
+          <w:i w:val="0"/>
+        </w:rPr>
+        <w:t>AWS</w:t>
+      </w:r>
+      <w:r>
+        <w:rPr>
+          <w:b w:val="0"/>
+          <w:i w:val="0"/>
+        </w:rPr>
+        <w:t xml:space="preserve"> database. Trust this doc and the screenshots over the Vite references.</w:t>
       </w:r>
     </w:p>
     <w:p/>
@@ -1561,6 +1927,10 @@
     </w:p>
     <w:p>
       <w:r>
+        <w:rPr>
+          <w:b w:val="0"/>
+          <w:i w:val="0"/>
+        </w:rPr>
         <w:t>The Python service (</w:t>
       </w:r>
       <w:hyperlink r:id="rId12">
@@ -1573,16 +1943,26 @@
         </w:r>
       </w:hyperlink>
       <w:r>
+        <w:rPr>
+          <w:b w:val="0"/>
+          <w:i w:val="0"/>
+        </w:rPr>
         <w:t xml:space="preserve">, started with </w:t>
       </w:r>
       <w:r>
         <w:rPr>
           <w:rFonts w:ascii="Consolas" w:hAnsi="Consolas"/>
+          <w:b w:val="0"/>
+          <w:i w:val="0"/>
           <w:sz w:val="19"/>
         </w:rPr>
         <w:t>web: gunicorn app:app</w:t>
       </w:r>
       <w:r>
+        <w:rPr>
+          <w:b w:val="0"/>
+          <w:i w:val="0"/>
+        </w:rPr>
         <w:t xml:space="preserve"> via </w:t>
       </w:r>
       <w:hyperlink r:id="rId21">
@@ -1595,24 +1975,38 @@
         </w:r>
       </w:hyperlink>
       <w:r>
+        <w:rPr>
+          <w:b w:val="0"/>
+          <w:i w:val="0"/>
+        </w:rPr>
         <w:t xml:space="preserve">). It powers everything conversational and every generated PDF — the child/spousal support calculators, the matter-intake agent, and the downloadable reports. It is </w:t>
       </w:r>
       <w:r>
         <w:rPr>
           <w:b/>
+          <w:i w:val="0"/>
         </w:rPr>
         <w:t>stateless</w:t>
       </w:r>
       <w:r>
+        <w:rPr>
+          <w:b w:val="0"/>
+          <w:i w:val="0"/>
+        </w:rPr>
         <w:t xml:space="preserve"> and talks only to Anthropic; it does </w:t>
       </w:r>
       <w:r>
         <w:rPr>
           <w:b/>
+          <w:i w:val="0"/>
         </w:rPr>
         <w:t>not</w:t>
       </w:r>
       <w:r>
+        <w:rPr>
+          <w:b w:val="0"/>
+          <w:i w:val="0"/>
+        </w:rPr>
         <w:t xml:space="preserve"> touch the database (all persistence is the frontend calling the auth-server). From the screenshot:</w:t>
       </w:r>
     </w:p>
@@ -1623,58 +2017,87 @@
       <w:r>
         <w:rPr>
           <w:b/>
+          <w:i w:val="0"/>
         </w:rPr>
         <w:t>Service name:</w:t>
       </w:r>
       <w:r>
+        <w:rPr>
+          <w:b w:val="0"/>
+          <w:i w:val="0"/>
+        </w:rPr>
         <w:t xml:space="preserve"> </w:t>
       </w:r>
       <w:r>
         <w:rPr>
           <w:rFonts w:ascii="Consolas" w:hAnsi="Consolas"/>
+          <w:b w:val="0"/>
+          <w:i w:val="0"/>
           <w:sz w:val="19"/>
         </w:rPr>
         <w:t>Calculator-code</w:t>
       </w:r>
       <w:r>
+        <w:rPr>
+          <w:b w:val="0"/>
+          <w:i w:val="0"/>
+        </w:rPr>
         <w:t xml:space="preserve"> · </w:t>
       </w:r>
       <w:r>
         <w:rPr>
           <w:b/>
+          <w:i w:val="0"/>
         </w:rPr>
         <w:t>Type:</w:t>
       </w:r>
       <w:r>
+        <w:rPr>
+          <w:b w:val="0"/>
+          <w:i w:val="0"/>
+        </w:rPr>
         <w:t xml:space="preserve"> Web Service · </w:t>
       </w:r>
       <w:r>
         <w:rPr>
           <w:b/>
+          <w:i w:val="0"/>
         </w:rPr>
         <w:t>Runtime:</w:t>
       </w:r>
       <w:r>
-        <w:t xml:space="preserve"> Python 3 ·</w:t>
-      </w:r>
-    </w:p>
-    <w:p>
+        <w:rPr>
+          <w:b w:val="0"/>
+          <w:i w:val="0"/>
+        </w:rPr>
+        <w:t xml:space="preserve"> Python 3 · </w:t>
+      </w:r>
       <w:r>
         <w:rPr>
           <w:b/>
+          <w:i w:val="0"/>
         </w:rPr>
         <w:t>Instance:</w:t>
       </w:r>
       <w:r>
+        <w:rPr>
+          <w:b w:val="0"/>
+          <w:i w:val="0"/>
+        </w:rPr>
         <w:t xml:space="preserve"> </w:t>
       </w:r>
       <w:r>
         <w:rPr>
           <w:b/>
+          <w:i w:val="0"/>
         </w:rPr>
         <w:t>Free</w:t>
       </w:r>
       <w:r>
+        <w:rPr>
+          <w:b w:val="0"/>
+          <w:i w:val="0"/>
+        </w:rPr>
         <w:t>.</w:t>
       </w:r>
     </w:p>
@@ -1685,20 +2108,31 @@
       <w:r>
         <w:rPr>
           <w:b/>
+          <w:i w:val="0"/>
         </w:rPr>
         <w:t>Service ID:</w:t>
       </w:r>
       <w:r>
+        <w:rPr>
+          <w:b w:val="0"/>
+          <w:i w:val="0"/>
+        </w:rPr>
         <w:t xml:space="preserve"> </w:t>
       </w:r>
       <w:r>
         <w:rPr>
           <w:rFonts w:ascii="Consolas" w:hAnsi="Consolas"/>
+          <w:b w:val="0"/>
+          <w:i w:val="0"/>
           <w:sz w:val="19"/>
         </w:rPr>
         <w:t>srv-d8c47m0js32c7384tscg</w:t>
       </w:r>
       <w:r>
+        <w:rPr>
+          <w:b w:val="0"/>
+          <w:i w:val="0"/>
+        </w:rPr>
         <w:t>.</w:t>
       </w:r>
     </w:p>
@@ -1709,32 +2143,47 @@
       <w:r>
         <w:rPr>
           <w:b/>
+          <w:i w:val="0"/>
         </w:rPr>
         <w:t>Public URL:</w:t>
       </w:r>
       <w:r>
+        <w:rPr>
+          <w:b w:val="0"/>
+          <w:i w:val="0"/>
+        </w:rPr>
         <w:t xml:space="preserve"> </w:t>
       </w:r>
       <w:r>
         <w:rPr>
           <w:rFonts w:ascii="Consolas" w:hAnsi="Consolas"/>
+          <w:b w:val="0"/>
+          <w:i w:val="0"/>
           <w:sz w:val="19"/>
         </w:rPr>
         <w:t>https://calculator-code-x2b4.onrender.com</w:t>
       </w:r>
       <w:r>
-        <w:t xml:space="preserve"> (this is the frontend's</w:t>
-      </w:r>
-    </w:p>
-    <w:p>
+        <w:rPr>
+          <w:b w:val="0"/>
+          <w:i w:val="0"/>
+        </w:rPr>
+        <w:t xml:space="preserve"> (this is the frontend's </w:t>
+      </w:r>
       <w:r>
         <w:rPr>
           <w:rFonts w:ascii="Consolas" w:hAnsi="Consolas"/>
+          <w:b w:val="0"/>
+          <w:i w:val="0"/>
           <w:sz w:val="19"/>
         </w:rPr>
         <w:t>CALCULATOR_API</w:t>
       </w:r>
       <w:r>
+        <w:rPr>
+          <w:b w:val="0"/>
+          <w:i w:val="0"/>
+        </w:rPr>
         <w:t xml:space="preserve"> default).</w:t>
       </w:r>
     </w:p>
@@ -1743,26 +2192,42 @@
         <w:pStyle w:val="ListBullet"/>
       </w:pPr>
       <w:r>
+        <w:rPr>
+          <w:b w:val="0"/>
+          <w:i w:val="0"/>
+        </w:rPr>
         <w:t xml:space="preserve">Deploys from </w:t>
       </w:r>
       <w:r>
         <w:rPr>
           <w:rFonts w:ascii="Consolas" w:hAnsi="Consolas"/>
+          <w:b w:val="0"/>
+          <w:i w:val="0"/>
           <w:sz w:val="19"/>
         </w:rPr>
         <w:t>cloudactai/Calculator-code</w:t>
       </w:r>
       <w:r>
+        <w:rPr>
+          <w:b w:val="0"/>
+          <w:i w:val="0"/>
+        </w:rPr>
         <w:t xml:space="preserve">, branch </w:t>
       </w:r>
       <w:r>
         <w:rPr>
           <w:rFonts w:ascii="Consolas" w:hAnsi="Consolas"/>
+          <w:b w:val="0"/>
+          <w:i w:val="0"/>
           <w:sz w:val="19"/>
         </w:rPr>
         <w:t>main</w:t>
       </w:r>
       <w:r>
+        <w:rPr>
+          <w:b w:val="0"/>
+          <w:i w:val="0"/>
+        </w:rPr>
         <w:t>.</w:t>
       </w:r>
     </w:p>
@@ -1793,6 +2258,7 @@
             <w:r>
               <w:rPr>
                 <w:b/>
+                <w:i w:val="0"/>
               </w:rPr>
               <w:t>Variable</w:t>
             </w:r>
@@ -1806,6 +2272,7 @@
             <w:r>
               <w:rPr>
                 <w:b/>
+                <w:i w:val="0"/>
               </w:rPr>
               <w:t>Purpose</w:t>
             </w:r>
@@ -1821,6 +2288,8 @@
             <w:r>
               <w:rPr>
                 <w:rFonts w:ascii="Consolas" w:hAnsi="Consolas"/>
+                <w:b w:val="0"/>
+                <w:i w:val="0"/>
                 <w:sz w:val="19"/>
               </w:rPr>
               <w:t>ANTHROPIC_API_KEY</w:t>
@@ -1833,15 +2302,24 @@
           </w:tcPr>
           <w:p>
             <w:r>
+              <w:rPr>
+                <w:b w:val="0"/>
+                <w:i w:val="0"/>
+              </w:rPr>
               <w:t xml:space="preserve">Auth for the Anthropic API. Every chat/report call uses it. If it's missing, expired, or over quota, </w:t>
             </w:r>
             <w:r>
               <w:rPr>
                 <w:b/>
+                <w:i w:val="0"/>
               </w:rPr>
               <w:t>all</w:t>
             </w:r>
             <w:r>
+              <w:rPr>
+                <w:b w:val="0"/>
+                <w:i w:val="0"/>
+              </w:rPr>
               <w:t xml:space="preserve"> AI features fail (chat replies error, reports won't generate).</w:t>
             </w:r>
           </w:p>
@@ -1856,6 +2334,8 @@
             <w:r>
               <w:rPr>
                 <w:rFonts w:ascii="Consolas" w:hAnsi="Consolas"/>
+                <w:b w:val="0"/>
+                <w:i w:val="0"/>
                 <w:sz w:val="19"/>
               </w:rPr>
               <w:t>CLAUDE_MODEL</w:t>
@@ -1868,36 +2348,58 @@
           </w:tcPr>
           <w:p>
             <w:r>
+              <w:rPr>
+                <w:b w:val="0"/>
+                <w:i w:val="0"/>
+              </w:rPr>
               <w:t xml:space="preserve">Which Claude model to call. Read in </w:t>
             </w:r>
             <w:r>
               <w:rPr>
                 <w:rFonts w:ascii="Consolas" w:hAnsi="Consolas"/>
+                <w:b w:val="0"/>
+                <w:i w:val="0"/>
                 <w:sz w:val="19"/>
               </w:rPr>
               <w:t>app.py</w:t>
             </w:r>
             <w:r>
+              <w:rPr>
+                <w:b w:val="0"/>
+                <w:i w:val="0"/>
+              </w:rPr>
               <w:t xml:space="preserve"> as </w:t>
             </w:r>
             <w:r>
               <w:rPr>
                 <w:rFonts w:ascii="Consolas" w:hAnsi="Consolas"/>
+                <w:b w:val="0"/>
+                <w:i w:val="0"/>
                 <w:sz w:val="19"/>
               </w:rPr>
               <w:t>os.getenv("CLAUDE_MODEL", "claude-sonnet-4-6")</w:t>
             </w:r>
             <w:r>
+              <w:rPr>
+                <w:b w:val="0"/>
+                <w:i w:val="0"/>
+              </w:rPr>
               <w:t xml:space="preserve"> — so if unset it defaults to </w:t>
             </w:r>
             <w:r>
               <w:rPr>
                 <w:rFonts w:ascii="Consolas" w:hAnsi="Consolas"/>
+                <w:b w:val="0"/>
+                <w:i w:val="0"/>
                 <w:sz w:val="19"/>
               </w:rPr>
               <w:t>claude-sonnet-4-6</w:t>
             </w:r>
             <w:r>
+              <w:rPr>
+                <w:b w:val="0"/>
+                <w:i w:val="0"/>
+              </w:rPr>
               <w:t>. Set it here to pin/upgrade the model without a code change.</w:t>
             </w:r>
           </w:p>
@@ -1912,35 +2414,30 @@
       <w:r>
         <w:rPr>
           <w:b/>
+          <w:i w:val="0"/>
         </w:rPr>
         <w:t>Free-instance cold starts.</w:t>
       </w:r>
       <w:r>
-        <w:t xml:space="preserve"> A Free Render web service spins down when idle and</w:t>
-      </w:r>
-    </w:p>
-    <w:p>
-      <w:pPr>
-        <w:pStyle w:val="IntenseQuote"/>
-      </w:pPr>
-      <w:r>
-        <w:t>takes ~30–60s to wake. That's exactly why the chat panels show *"Warming up the</w:t>
-      </w:r>
-    </w:p>
-    <w:p>
-      <w:pPr>
-        <w:pStyle w:val="IntenseQuote"/>
-      </w:pPr>
-      <w:r>
-        <w:t>server — first reply can take ~30s…"* and why the frontend axios timeout is 75s</w:t>
-      </w:r>
-    </w:p>
-    <w:p>
-      <w:pPr>
-        <w:pStyle w:val="IntenseQuote"/>
-      </w:pPr>
-      <w:r>
-        <w:t>(</w:t>
+        <w:rPr>
+          <w:b w:val="0"/>
+          <w:i w:val="0"/>
+        </w:rPr>
+        <w:t xml:space="preserve"> A Free Render web service spins down when idle and takes ~30–60s to wake. That's exactly why the chat panels show </w:t>
+      </w:r>
+      <w:r>
+        <w:rPr>
+          <w:b w:val="0"/>
+          <w:i/>
+        </w:rPr>
+        <w:t>"Warming up the server — first reply can take ~30s…"</w:t>
+      </w:r>
+      <w:r>
+        <w:rPr>
+          <w:b w:val="0"/>
+          <w:i w:val="0"/>
+        </w:rPr>
+        <w:t xml:space="preserve"> and why the frontend axios timeout is 75s (</w:t>
       </w:r>
       <w:hyperlink r:id="rId22">
         <w:r>
@@ -1952,24 +2449,25 @@
         </w:r>
       </w:hyperlink>
       <w:r>
+        <w:rPr>
+          <w:b w:val="0"/>
+          <w:i w:val="0"/>
+        </w:rPr>
         <w:t xml:space="preserve">). A slow </w:t>
       </w:r>
       <w:r>
         <w:rPr>
           <w:b/>
+          <w:i w:val="0"/>
         </w:rPr>
         <w:t>first</w:t>
       </w:r>
       <w:r>
-        <w:t xml:space="preserve"> message after</w:t>
-      </w:r>
-    </w:p>
-    <w:p>
-      <w:pPr>
-        <w:pStyle w:val="IntenseQuote"/>
-      </w:pPr>
-      <w:r>
-        <w:t>a quiet period is normal, not a bug.</w:t>
+        <w:rPr>
+          <w:b w:val="0"/>
+          <w:i w:val="0"/>
+        </w:rPr>
+        <w:t xml:space="preserve"> message after a quiet period is normal, not a bug.</w:t>
       </w:r>
     </w:p>
     <w:p/>
@@ -2034,6 +2532,10 @@
     </w:p>
     <w:p>
       <w:r>
+        <w:rPr>
+          <w:b w:val="0"/>
+          <w:i w:val="0"/>
+        </w:rPr>
         <w:t>The Node/Express + Prisma service (</w:t>
       </w:r>
       <w:hyperlink r:id="rId11">
@@ -2046,6 +2548,10 @@
         </w:r>
       </w:hyperlink>
       <w:r>
+        <w:rPr>
+          <w:b w:val="0"/>
+          <w:i w:val="0"/>
+        </w:rPr>
         <w:t xml:space="preserve">, entry </w:t>
       </w:r>
       <w:hyperlink r:id="rId24">
@@ -2058,15 +2564,24 @@
         </w:r>
       </w:hyperlink>
       <w:r>
+        <w:rPr>
+          <w:b w:val="0"/>
+          <w:i w:val="0"/>
+        </w:rPr>
         <w:t xml:space="preserve">). This is the </w:t>
       </w:r>
       <w:r>
         <w:rPr>
           <w:b/>
+          <w:i w:val="0"/>
         </w:rPr>
         <w:t>only</w:t>
       </w:r>
       <w:r>
+        <w:rPr>
+          <w:b w:val="0"/>
+          <w:i w:val="0"/>
+        </w:rPr>
         <w:t xml:space="preserve"> thing that reads and writes the database. It serves two families of routes:</w:t>
       </w:r>
     </w:p>
@@ -2077,23 +2592,33 @@
       <w:r>
         <w:rPr>
           <w:rFonts w:ascii="Consolas" w:hAnsi="Consolas"/>
+          <w:b w:val="0"/>
+          <w:i w:val="0"/>
           <w:sz w:val="19"/>
         </w:rPr>
         <w:t>/api/*</w:t>
       </w:r>
       <w:r>
-        <w:t xml:space="preserve"> — accounts &amp; sessions: signup, login, verify-email, forgot/reset password,</w:t>
-      </w:r>
-    </w:p>
-    <w:p>
+        <w:rPr>
+          <w:b w:val="0"/>
+          <w:i w:val="0"/>
+        </w:rPr>
+        <w:t xml:space="preserve"> — accounts &amp; sessions: signup, login, verify-email, forgot/reset password, </w:t>
+      </w:r>
       <w:r>
         <w:rPr>
           <w:rFonts w:ascii="Consolas" w:hAnsi="Consolas"/>
+          <w:b w:val="0"/>
+          <w:i w:val="0"/>
           <w:sz w:val="19"/>
         </w:rPr>
         <w:t>/api/me</w:t>
       </w:r>
       <w:r>
+        <w:rPr>
+          <w:b w:val="0"/>
+          <w:i w:val="0"/>
+        </w:rPr>
         <w:t>, logout. Sessions are JWTs in a cross-domain cookie.</w:t>
       </w:r>
     </w:p>
@@ -2104,17 +2629,18 @@
       <w:r>
         <w:rPr>
           <w:rFonts w:ascii="Consolas" w:hAnsi="Consolas"/>
+          <w:b w:val="0"/>
+          <w:i w:val="0"/>
           <w:sz w:val="19"/>
         </w:rPr>
         <w:t>/v1/*</w:t>
       </w:r>
       <w:r>
-        <w:t xml:space="preserve"> — the app data: matters, forms, folders, task states, form-template PDFs</w:t>
-      </w:r>
-    </w:p>
-    <w:p>
-      <w:r>
-        <w:t xml:space="preserve">(everything </w:t>
+        <w:rPr>
+          <w:b w:val="0"/>
+          <w:i w:val="0"/>
+        </w:rPr>
+        <w:t xml:space="preserve"> — the app data: matters, forms, folders, task states, form-template PDFs (everything </w:t>
       </w:r>
       <w:hyperlink r:id="rId25">
         <w:r>
@@ -2126,59 +2652,95 @@
         </w:r>
       </w:hyperlink>
       <w:r>
+        <w:rPr>
+          <w:b w:val="0"/>
+          <w:i w:val="0"/>
+        </w:rPr>
         <w:t xml:space="preserve"> and the matter Redux actions call).</w:t>
       </w:r>
     </w:p>
     <w:p>
       <w:r>
+        <w:rPr>
+          <w:b w:val="0"/>
+          <w:i w:val="0"/>
+        </w:rPr>
         <w:t xml:space="preserve">From the screenshot: </w:t>
       </w:r>
       <w:r>
         <w:rPr>
           <w:b/>
+          <w:i w:val="0"/>
         </w:rPr>
         <w:t>Service ID</w:t>
       </w:r>
       <w:r>
+        <w:rPr>
+          <w:b w:val="0"/>
+          <w:i w:val="0"/>
+        </w:rPr>
         <w:t xml:space="preserve"> </w:t>
       </w:r>
       <w:r>
         <w:rPr>
           <w:rFonts w:ascii="Consolas" w:hAnsi="Consolas"/>
+          <w:b w:val="0"/>
+          <w:i w:val="0"/>
           <w:sz w:val="19"/>
         </w:rPr>
         <w:t>srv-d939g4vavr4c73bma26g</w:t>
       </w:r>
       <w:r>
+        <w:rPr>
+          <w:b w:val="0"/>
+          <w:i w:val="0"/>
+        </w:rPr>
         <w:t xml:space="preserve">, name </w:t>
       </w:r>
       <w:r>
         <w:rPr>
           <w:rFonts w:ascii="Consolas" w:hAnsi="Consolas"/>
+          <w:b w:val="0"/>
+          <w:i w:val="0"/>
           <w:sz w:val="19"/>
         </w:rPr>
         <w:t>Calculator-code-auth</w:t>
       </w:r>
       <w:r>
+        <w:rPr>
+          <w:b w:val="0"/>
+          <w:i w:val="0"/>
+        </w:rPr>
         <w:t xml:space="preserve">. Its </w:t>
       </w:r>
       <w:r>
         <w:rPr>
           <w:b/>
+          <w:i w:val="0"/>
         </w:rPr>
         <w:t>start command</w:t>
       </w:r>
       <w:r>
+        <w:rPr>
+          <w:b w:val="0"/>
+          <w:i w:val="0"/>
+        </w:rPr>
         <w:t xml:space="preserve"> runs migrations then boots: </w:t>
       </w:r>
       <w:r>
         <w:rPr>
           <w:rFonts w:ascii="Consolas" w:hAnsi="Consolas"/>
+          <w:b w:val="0"/>
+          <w:i w:val="0"/>
           <w:sz w:val="19"/>
         </w:rPr>
         <w:t>npx prisma migrate deploy &amp;&amp; node server.js</w:t>
       </w:r>
       <w:r>
+        <w:rPr>
+          <w:b w:val="0"/>
+          <w:i w:val="0"/>
+        </w:rPr>
         <w:t xml:space="preserve"> (see </w:t>
       </w:r>
       <w:hyperlink r:id="rId26">
@@ -2191,6 +2753,10 @@
         </w:r>
       </w:hyperlink>
       <w:r>
+        <w:rPr>
+          <w:b w:val="0"/>
+          <w:i w:val="0"/>
+        </w:rPr>
         <w:t>).</w:t>
       </w:r>
     </w:p>
@@ -2221,6 +2787,7 @@
             <w:r>
               <w:rPr>
                 <w:b/>
+                <w:i w:val="0"/>
               </w:rPr>
               <w:t>Variable</w:t>
             </w:r>
@@ -2234,6 +2801,7 @@
             <w:r>
               <w:rPr>
                 <w:b/>
+                <w:i w:val="0"/>
               </w:rPr>
               <w:t>Purpose</w:t>
             </w:r>
@@ -2249,6 +2817,8 @@
             <w:r>
               <w:rPr>
                 <w:rFonts w:ascii="Consolas" w:hAnsi="Consolas"/>
+                <w:b w:val="0"/>
+                <w:i w:val="0"/>
                 <w:sz w:val="19"/>
               </w:rPr>
               <w:t>DATABASE_URL</w:t>
@@ -2261,35 +2831,56 @@
           </w:tcPr>
           <w:p>
             <w:r>
+              <w:rPr>
+                <w:b w:val="0"/>
+                <w:i w:val="0"/>
+              </w:rPr>
               <w:t xml:space="preserve">Postgres connection string → the </w:t>
             </w:r>
             <w:r>
               <w:rPr>
                 <w:b/>
+                <w:i w:val="0"/>
               </w:rPr>
               <w:t>AWS RDS</w:t>
             </w:r>
             <w:r>
+              <w:rPr>
+                <w:b w:val="0"/>
+                <w:i w:val="0"/>
+              </w:rPr>
               <w:t xml:space="preserve"> database (see §4). Prisma/</w:t>
             </w:r>
             <w:r>
               <w:rPr>
                 <w:rFonts w:ascii="Consolas" w:hAnsi="Consolas"/>
+                <w:b w:val="0"/>
+                <w:i w:val="0"/>
                 <w:sz w:val="19"/>
               </w:rPr>
               <w:t>pg</w:t>
             </w:r>
             <w:r>
+              <w:rPr>
+                <w:b w:val="0"/>
+                <w:i w:val="0"/>
+              </w:rPr>
               <w:t xml:space="preserve"> connect through it; SSL is auto-enabled for </w:t>
             </w:r>
             <w:r>
               <w:rPr>
                 <w:rFonts w:ascii="Consolas" w:hAnsi="Consolas"/>
+                <w:b w:val="0"/>
+                <w:i w:val="0"/>
                 <w:sz w:val="19"/>
               </w:rPr>
               <w:t>*.rds.amazonaws.com</w:t>
             </w:r>
             <w:r>
+              <w:rPr>
+                <w:b w:val="0"/>
+                <w:i w:val="0"/>
+              </w:rPr>
               <w:t xml:space="preserve"> hosts (</w:t>
             </w:r>
             <w:hyperlink r:id="rId27">
@@ -2302,6 +2893,10 @@
               </w:r>
             </w:hyperlink>
             <w:r>
+              <w:rPr>
+                <w:b w:val="0"/>
+                <w:i w:val="0"/>
+              </w:rPr>
               <w:t>). This is the single most critical secret — if it's wrong/expired, the whole app can't load or save anything.</w:t>
             </w:r>
           </w:p>
@@ -2316,6 +2911,8 @@
             <w:r>
               <w:rPr>
                 <w:rFonts w:ascii="Consolas" w:hAnsi="Consolas"/>
+                <w:b w:val="0"/>
+                <w:i w:val="0"/>
                 <w:sz w:val="19"/>
               </w:rPr>
               <w:t>JWT_SECRET</w:t>
@@ -2328,11 +2925,16 @@
           </w:tcPr>
           <w:p>
             <w:r>
+              <w:rPr>
+                <w:b w:val="0"/>
+                <w:i w:val="0"/>
+              </w:rPr>
               <w:t xml:space="preserve">Long random secret that signs session JWTs. </w:t>
             </w:r>
             <w:r>
               <w:rPr>
                 <w:b/>
+                <w:i w:val="0"/>
               </w:rPr>
               <w:t>Rotating it logs everyone out.</w:t>
             </w:r>
@@ -2348,6 +2950,8 @@
             <w:r>
               <w:rPr>
                 <w:rFonts w:ascii="Consolas" w:hAnsi="Consolas"/>
+                <w:b w:val="0"/>
+                <w:i w:val="0"/>
                 <w:sz w:val="19"/>
               </w:rPr>
               <w:t>FRONTEND_URL</w:t>
@@ -2360,26 +2964,55 @@
           </w:tcPr>
           <w:p>
             <w:r>
+              <w:rPr>
+                <w:b w:val="0"/>
+                <w:i w:val="0"/>
+              </w:rPr>
               <w:t>The exact Vercel origin (</w:t>
             </w:r>
             <w:r>
               <w:rPr>
                 <w:rFonts w:ascii="Consolas" w:hAnsi="Consolas"/>
+                <w:b w:val="0"/>
+                <w:i w:val="0"/>
                 <w:sz w:val="19"/>
               </w:rPr>
               <w:t>https://app.cloudforlawfirms.com</w:t>
             </w:r>
             <w:r>
+              <w:rPr>
+                <w:b w:val="0"/>
+                <w:i w:val="0"/>
+              </w:rPr>
               <w:t xml:space="preserve">, no trailing slash). Used for </w:t>
             </w:r>
             <w:r>
               <w:rPr>
                 <w:b/>
+                <w:i w:val="0"/>
               </w:rPr>
               <w:t>CORS</w:t>
             </w:r>
             <w:r>
-              <w:t xml:space="preserve"> *and* as the base of links in verification/reset emails.</w:t>
+              <w:rPr>
+                <w:b w:val="0"/>
+                <w:i w:val="0"/>
+              </w:rPr>
+              <w:t xml:space="preserve"> </w:t>
+            </w:r>
+            <w:r>
+              <w:rPr>
+                <w:b w:val="0"/>
+                <w:i/>
+              </w:rPr>
+              <w:t>and</w:t>
+            </w:r>
+            <w:r>
+              <w:rPr>
+                <w:b w:val="0"/>
+                <w:i w:val="0"/>
+              </w:rPr>
+              <w:t xml:space="preserve"> as the base of links in verification/reset emails.</w:t>
             </w:r>
           </w:p>
         </w:tc>
@@ -2393,6 +3026,8 @@
             <w:r>
               <w:rPr>
                 <w:rFonts w:ascii="Consolas" w:hAnsi="Consolas"/>
+                <w:b w:val="0"/>
+                <w:i w:val="0"/>
                 <w:sz w:val="19"/>
               </w:rPr>
               <w:t>NODE_ENV</w:t>
@@ -2405,16 +3040,26 @@
           </w:tcPr>
           <w:p>
             <w:r>
+              <w:rPr>
+                <w:b w:val="0"/>
+                <w:i w:val="0"/>
+              </w:rPr>
               <w:t xml:space="preserve">Must be </w:t>
             </w:r>
             <w:r>
               <w:rPr>
                 <w:rFonts w:ascii="Consolas" w:hAnsi="Consolas"/>
+                <w:b w:val="0"/>
+                <w:i w:val="0"/>
                 <w:sz w:val="19"/>
               </w:rPr>
               <w:t>production</w:t>
             </w:r>
             <w:r>
+              <w:rPr>
+                <w:b w:val="0"/>
+                <w:i w:val="0"/>
+              </w:rPr>
               <w:t xml:space="preserve"> in prod — otherwise the cross-domain session cookie is dropped by the browser and logins silently don't stick.</w:t>
             </w:r>
           </w:p>
@@ -2429,6 +3074,8 @@
             <w:r>
               <w:rPr>
                 <w:rFonts w:ascii="Consolas" w:hAnsi="Consolas"/>
+                <w:b w:val="0"/>
+                <w:i w:val="0"/>
                 <w:sz w:val="19"/>
               </w:rPr>
               <w:t>EMAIL_MICROSOFT_TENANT_ID</w:t>
@@ -2441,15 +3088,24 @@
           </w:tcPr>
           <w:p>
             <w:r>
+              <w:rPr>
+                <w:b w:val="0"/>
+                <w:i w:val="0"/>
+              </w:rPr>
               <w:t xml:space="preserve">Microsoft Graph (Entra) tenant ID — used to </w:t>
             </w:r>
             <w:r>
               <w:rPr>
                 <w:b/>
+                <w:i w:val="0"/>
               </w:rPr>
               <w:t>send</w:t>
             </w:r>
             <w:r>
+              <w:rPr>
+                <w:b w:val="0"/>
+                <w:i w:val="0"/>
+              </w:rPr>
               <w:t xml:space="preserve"> transactional email (verify, reset).</w:t>
             </w:r>
           </w:p>
@@ -2464,6 +3120,8 @@
             <w:r>
               <w:rPr>
                 <w:rFonts w:ascii="Consolas" w:hAnsi="Consolas"/>
+                <w:b w:val="0"/>
+                <w:i w:val="0"/>
                 <w:sz w:val="19"/>
               </w:rPr>
               <w:t>EMAIL_MICROSOFT_CLIENT_ID</w:t>
@@ -2476,6 +3134,10 @@
           </w:tcPr>
           <w:p>
             <w:r>
+              <w:rPr>
+                <w:b w:val="0"/>
+                <w:i w:val="0"/>
+              </w:rPr>
               <w:t>The Graph app-registration client ID.</w:t>
             </w:r>
           </w:p>
@@ -2490,6 +3152,8 @@
             <w:r>
               <w:rPr>
                 <w:rFonts w:ascii="Consolas" w:hAnsi="Consolas"/>
+                <w:b w:val="0"/>
+                <w:i w:val="0"/>
                 <w:sz w:val="19"/>
               </w:rPr>
               <w:t>EMAIL_MICROSOFT_CLIENT_SECRET</w:t>
@@ -2502,15 +3166,24 @@
           </w:tcPr>
           <w:p>
             <w:r>
+              <w:rPr>
+                <w:b w:val="0"/>
+                <w:i w:val="0"/>
+              </w:rPr>
               <w:t xml:space="preserve">The Graph app client secret. </w:t>
             </w:r>
             <w:r>
               <w:rPr>
                 <w:b/>
+                <w:i w:val="0"/>
               </w:rPr>
               <w:t>This one expires</w:t>
             </w:r>
             <w:r>
+              <w:rPr>
+                <w:b w:val="0"/>
+                <w:i w:val="0"/>
+              </w:rPr>
               <w:t xml:space="preserve"> (see the caveat below).</w:t>
             </w:r>
           </w:p>
@@ -2525,6 +3198,8 @@
             <w:r>
               <w:rPr>
                 <w:rFonts w:ascii="Consolas" w:hAnsi="Consolas"/>
+                <w:b w:val="0"/>
+                <w:i w:val="0"/>
                 <w:sz w:val="19"/>
               </w:rPr>
               <w:t>EMAIL_MICROSOFT_SENDER_EMAIL</w:t>
@@ -2537,16 +3212,26 @@
           </w:tcPr>
           <w:p>
             <w:r>
+              <w:rPr>
+                <w:b w:val="0"/>
+                <w:i w:val="0"/>
+              </w:rPr>
               <w:t xml:space="preserve">The from-address, </w:t>
             </w:r>
             <w:r>
               <w:rPr>
                 <w:rFonts w:ascii="Consolas" w:hAnsi="Consolas"/>
+                <w:b w:val="0"/>
+                <w:i w:val="0"/>
                 <w:sz w:val="19"/>
               </w:rPr>
               <w:t>notifications@cloudforlawfirms.com</w:t>
             </w:r>
             <w:r>
+              <w:rPr>
+                <w:b w:val="0"/>
+                <w:i w:val="0"/>
+              </w:rPr>
               <w:t>.</w:t>
             </w:r>
           </w:p>
@@ -2561,6 +3246,8 @@
             <w:r>
               <w:rPr>
                 <w:rFonts w:ascii="Consolas" w:hAnsi="Consolas"/>
+                <w:b w:val="0"/>
+                <w:i w:val="0"/>
                 <w:sz w:val="19"/>
               </w:rPr>
               <w:t>EMAIL_VERIFICATION_REQUIRED</w:t>
@@ -2575,31 +3262,49 @@
             <w:r>
               <w:rPr>
                 <w:rFonts w:ascii="Consolas" w:hAnsi="Consolas"/>
+                <w:b w:val="0"/>
+                <w:i w:val="0"/>
                 <w:sz w:val="19"/>
               </w:rPr>
               <w:t>true</w:t>
             </w:r>
             <w:r>
+              <w:rPr>
+                <w:b w:val="0"/>
+                <w:i w:val="0"/>
+              </w:rPr>
               <w:t>/</w:t>
             </w:r>
             <w:r>
               <w:rPr>
                 <w:rFonts w:ascii="Consolas" w:hAnsi="Consolas"/>
+                <w:b w:val="0"/>
+                <w:i w:val="0"/>
                 <w:sz w:val="19"/>
               </w:rPr>
               <w:t>false</w:t>
             </w:r>
             <w:r>
+              <w:rPr>
+                <w:b w:val="0"/>
+                <w:i w:val="0"/>
+              </w:rPr>
               <w:t xml:space="preserve"> — whether new signups must verify email before use. </w:t>
             </w:r>
             <w:r>
               <w:rPr>
                 <w:rFonts w:ascii="Consolas" w:hAnsi="Consolas"/>
+                <w:b w:val="0"/>
+                <w:i w:val="0"/>
                 <w:sz w:val="19"/>
               </w:rPr>
               <w:t>false</w:t>
             </w:r>
             <w:r>
+              <w:rPr>
+                <w:b w:val="0"/>
+                <w:i w:val="0"/>
+              </w:rPr>
               <w:t xml:space="preserve"> is a dev convenience, not a login bypass.</w:t>
             </w:r>
           </w:p>
@@ -2614,21 +3319,78 @@
       <w:r>
         <w:rPr>
           <w:b/>
+          <w:i w:val="0"/>
         </w:rPr>
         <w:t>Email uses Microsoft Graph.</w:t>
       </w:r>
       <w:r>
+        <w:rPr>
+          <w:b w:val="0"/>
+          <w:i w:val="0"/>
+        </w:rPr>
         <w:t xml:space="preserve"> The four </w:t>
       </w:r>
       <w:r>
         <w:rPr>
           <w:rFonts w:ascii="Consolas" w:hAnsi="Consolas"/>
+          <w:b w:val="0"/>
+          <w:i w:val="0"/>
           <w:sz w:val="19"/>
         </w:rPr>
         <w:t>EMAIL_MICROSOFT_*</w:t>
       </w:r>
       <w:r>
-        <w:t xml:space="preserve"> values authenticate an</w:t>
+        <w:rPr>
+          <w:b w:val="0"/>
+          <w:i w:val="0"/>
+        </w:rPr>
+        <w:t xml:space="preserve"> values authenticate an app-only (client-credentials) Microsoft Graph call with </w:t>
+      </w:r>
+      <w:r>
+        <w:rPr>
+          <w:rFonts w:ascii="Consolas" w:hAnsi="Consolas"/>
+          <w:b w:val="0"/>
+          <w:i w:val="0"/>
+          <w:sz w:val="19"/>
+        </w:rPr>
+        <w:t>Mail.Send</w:t>
+      </w:r>
+      <w:r>
+        <w:rPr>
+          <w:b w:val="0"/>
+          <w:i w:val="0"/>
+        </w:rPr>
+        <w:t xml:space="preserve"> on the shared mailbox — that's how the auth-server sends verification/reset email. A </w:t>
+      </w:r>
+      <w:r>
+        <w:rPr>
+          <w:b/>
+          <w:i w:val="0"/>
+        </w:rPr>
+        <w:t>separate</w:t>
+      </w:r>
+      <w:r>
+        <w:rPr>
+          <w:b w:val="0"/>
+          <w:i w:val="0"/>
+        </w:rPr>
+        <w:t xml:space="preserve"> doc will cover the Graph email flow in depth; for here, just know these four vars are the email sender's credentials and they were copied from the older </w:t>
+      </w:r>
+      <w:r>
+        <w:rPr>
+          <w:rFonts w:ascii="Consolas" w:hAnsi="Consolas"/>
+          <w:b w:val="0"/>
+          <w:i w:val="0"/>
+          <w:sz w:val="19"/>
+        </w:rPr>
+        <w:t>report-creation</w:t>
+      </w:r>
+      <w:r>
+        <w:rPr>
+          <w:b w:val="0"/>
+          <w:i w:val="0"/>
+        </w:rPr>
+        <w:t xml:space="preserve"> Render service.</w:t>
       </w:r>
     </w:p>
     <w:p>
@@ -2636,116 +3398,48 @@
         <w:pStyle w:val="IntenseQuote"/>
       </w:pPr>
       <w:r>
-        <w:t xml:space="preserve">app-only (client-credentials) Microsoft Graph call with </w:t>
+        <w:rPr>
+          <w:b/>
+          <w:i w:val="0"/>
+        </w:rPr>
+        <w:t>Shared-secret caveat:</w:t>
+      </w:r>
+      <w:r>
+        <w:rPr>
+          <w:b w:val="0"/>
+          <w:i w:val="0"/>
+        </w:rPr>
+        <w:t xml:space="preserve"> the client secret is currently shared with that other service, so when it expires </w:t>
+      </w:r>
+      <w:r>
+        <w:rPr>
+          <w:b/>
+          <w:i w:val="0"/>
+        </w:rPr>
+        <w:t>both</w:t>
+      </w:r>
+      <w:r>
+        <w:rPr>
+          <w:b w:val="0"/>
+          <w:i w:val="0"/>
+        </w:rPr>
+        <w:t xml:space="preserve"> stop sending at once — the tell is </w:t>
       </w:r>
       <w:r>
         <w:rPr>
           <w:rFonts w:ascii="Consolas" w:hAnsi="Consolas"/>
+          <w:b w:val="0"/>
+          <w:i w:val="0"/>
           <w:sz w:val="19"/>
         </w:rPr>
-        <w:t>Mail.Send</w:t>
-      </w:r>
-      <w:r>
-        <w:t xml:space="preserve"> on the shared</w:t>
-      </w:r>
-    </w:p>
-    <w:p>
-      <w:pPr>
-        <w:pStyle w:val="IntenseQuote"/>
-      </w:pPr>
-      <w:r>
-        <w:t xml:space="preserve">mailbox — that's how the auth-server sends verification/reset email. A </w:t>
-      </w:r>
-      <w:r>
-        <w:rPr>
-          <w:b/>
-        </w:rPr>
-        <w:t>separate</w:t>
-      </w:r>
-    </w:p>
-    <w:p>
-      <w:pPr>
-        <w:pStyle w:val="IntenseQuote"/>
-      </w:pPr>
-      <w:r>
-        <w:t>doc will cover the Graph email flow in depth; for here, just know these four vars are</w:t>
-      </w:r>
-    </w:p>
-    <w:p>
-      <w:pPr>
-        <w:pStyle w:val="IntenseQuote"/>
-      </w:pPr>
-      <w:r>
-        <w:t xml:space="preserve">the email sender's credentials and they were copied from the older </w:t>
-      </w:r>
-      <w:r>
-        <w:rPr>
-          <w:rFonts w:ascii="Consolas" w:hAnsi="Consolas"/>
-          <w:sz w:val="19"/>
-        </w:rPr>
-        <w:t>report-creation</w:t>
-      </w:r>
-    </w:p>
-    <w:p>
-      <w:pPr>
-        <w:pStyle w:val="IntenseQuote"/>
-      </w:pPr>
-      <w:r>
-        <w:t>Render service.</w:t>
-      </w:r>
-    </w:p>
-    <w:p>
-      <w:pPr>
-        <w:pStyle w:val="IntenseQuote"/>
-      </w:pPr>
-      <w:r>
-        <w:rPr>
-          <w:b/>
-        </w:rPr>
-        <w:t>Shared-secret caveat:</w:t>
-      </w:r>
-      <w:r>
-        <w:t xml:space="preserve"> the client secret is currently shared with that other</w:t>
-      </w:r>
-    </w:p>
-    <w:p>
-      <w:pPr>
-        <w:pStyle w:val="IntenseQuote"/>
-      </w:pPr>
-      <w:r>
-        <w:t xml:space="preserve">service, so when it expires </w:t>
-      </w:r>
-      <w:r>
-        <w:rPr>
-          <w:b/>
-        </w:rPr>
-        <w:t>both</w:t>
-      </w:r>
-      <w:r>
-        <w:t xml:space="preserve"> stop sending at once — the tell is</w:t>
-      </w:r>
-    </w:p>
-    <w:p>
-      <w:pPr>
-        <w:pStyle w:val="IntenseQuote"/>
-      </w:pPr>
-      <w:r>
-        <w:rPr>
-          <w:rFonts w:ascii="Consolas" w:hAnsi="Consolas"/>
-          <w:sz w:val="19"/>
-        </w:rPr>
         <w:t>Microsoft Graph token request failed: 401</w:t>
       </w:r>
       <w:r>
-        <w:t xml:space="preserve"> in the logs. Record its expiry and set a</w:t>
-      </w:r>
-    </w:p>
-    <w:p>
-      <w:pPr>
-        <w:pStyle w:val="IntenseQuote"/>
-      </w:pPr>
-      <w:r>
-        <w:t>reminder.</w:t>
+        <w:rPr>
+          <w:b w:val="0"/>
+          <w:i w:val="0"/>
+        </w:rPr>
+        <w:t xml:space="preserve"> in the logs. Record its expiry and set a reminder.</w:t>
       </w:r>
     </w:p>
     <w:p/>
@@ -2759,25 +3453,40 @@
     </w:p>
     <w:p>
       <w:r>
+        <w:rPr>
+          <w:b w:val="0"/>
+          <w:i w:val="0"/>
+        </w:rPr>
         <w:t xml:space="preserve">The database is </w:t>
       </w:r>
       <w:r>
         <w:rPr>
           <w:b/>
+          <w:i w:val="0"/>
         </w:rPr>
         <w:t>PostgreSQL on AWS RDS</w:t>
       </w:r>
       <w:r>
+        <w:rPr>
+          <w:b w:val="0"/>
+          <w:i w:val="0"/>
+        </w:rPr>
         <w:t xml:space="preserve">, reached only by the auth-server via </w:t>
       </w:r>
       <w:r>
         <w:rPr>
           <w:rFonts w:ascii="Consolas" w:hAnsi="Consolas"/>
+          <w:b w:val="0"/>
+          <w:i w:val="0"/>
           <w:sz w:val="19"/>
         </w:rPr>
         <w:t>DATABASE_URL</w:t>
       </w:r>
       <w:r>
+        <w:rPr>
+          <w:b w:val="0"/>
+          <w:i w:val="0"/>
+        </w:rPr>
         <w:t>. The schema is Prisma-managed:</w:t>
       </w:r>
     </w:p>
@@ -2786,6 +3495,10 @@
         <w:pStyle w:val="ListBullet"/>
       </w:pPr>
       <w:r>
+        <w:rPr>
+          <w:b w:val="0"/>
+          <w:i w:val="0"/>
+        </w:rPr>
         <w:t xml:space="preserve">Schema: </w:t>
       </w:r>
       <w:hyperlink r:id="rId13">
@@ -2798,38 +3511,58 @@
         </w:r>
       </w:hyperlink>
       <w:r>
+        <w:rPr>
+          <w:b w:val="0"/>
+          <w:i w:val="0"/>
+        </w:rPr>
         <w:t xml:space="preserve"> — </w:t>
       </w:r>
       <w:r>
         <w:rPr>
           <w:rFonts w:ascii="Consolas" w:hAnsi="Consolas"/>
+          <w:b w:val="0"/>
+          <w:i w:val="0"/>
           <w:sz w:val="19"/>
         </w:rPr>
         <w:t>datasource db</w:t>
       </w:r>
-    </w:p>
-    <w:p>
-      <w:r>
-        <w:t xml:space="preserve">is </w:t>
+      <w:r>
+        <w:rPr>
+          <w:b w:val="0"/>
+          <w:i w:val="0"/>
+        </w:rPr>
+        <w:t xml:space="preserve"> is </w:t>
       </w:r>
       <w:r>
         <w:rPr>
           <w:rFonts w:ascii="Consolas" w:hAnsi="Consolas"/>
+          <w:b w:val="0"/>
+          <w:i w:val="0"/>
           <w:sz w:val="19"/>
         </w:rPr>
         <w:t>provider = "postgresql"</w:t>
       </w:r>
       <w:r>
+        <w:rPr>
+          <w:b w:val="0"/>
+          <w:i w:val="0"/>
+        </w:rPr>
         <w:t xml:space="preserve">, </w:t>
       </w:r>
       <w:r>
         <w:rPr>
           <w:rFonts w:ascii="Consolas" w:hAnsi="Consolas"/>
+          <w:b w:val="0"/>
+          <w:i w:val="0"/>
           <w:sz w:val="19"/>
         </w:rPr>
         <w:t>url = env("DATABASE_URL")</w:t>
       </w:r>
       <w:r>
+        <w:rPr>
+          <w:b w:val="0"/>
+          <w:i w:val="0"/>
+        </w:rPr>
         <w:t>.</w:t>
       </w:r>
     </w:p>
@@ -2838,6 +3571,10 @@
         <w:pStyle w:val="ListBullet"/>
       </w:pPr>
       <w:r>
+        <w:rPr>
+          <w:b w:val="0"/>
+          <w:i w:val="0"/>
+        </w:rPr>
         <w:t xml:space="preserve">Connection: </w:t>
       </w:r>
       <w:hyperlink r:id="rId27">
@@ -2850,70 +3587,104 @@
         </w:r>
       </w:hyperlink>
       <w:r>
-        <w:t xml:space="preserve"> wires Prisma</w:t>
-      </w:r>
-    </w:p>
-    <w:p>
-      <w:r>
-        <w:t xml:space="preserve">through the </w:t>
+        <w:rPr>
+          <w:b w:val="0"/>
+          <w:i w:val="0"/>
+        </w:rPr>
+        <w:t xml:space="preserve"> wires Prisma through the </w:t>
       </w:r>
       <w:r>
         <w:rPr>
           <w:rFonts w:ascii="Consolas" w:hAnsi="Consolas"/>
+          <w:b w:val="0"/>
+          <w:i w:val="0"/>
           <w:sz w:val="19"/>
         </w:rPr>
         <w:t>pg</w:t>
       </w:r>
       <w:r>
+        <w:rPr>
+          <w:b w:val="0"/>
+          <w:i w:val="0"/>
+        </w:rPr>
         <w:t xml:space="preserve"> </w:t>
       </w:r>
       <w:r>
         <w:rPr>
           <w:rFonts w:ascii="Consolas" w:hAnsi="Consolas"/>
+          <w:b w:val="0"/>
+          <w:i w:val="0"/>
           <w:sz w:val="19"/>
         </w:rPr>
         <w:t>Pool</w:t>
       </w:r>
       <w:r>
+        <w:rPr>
+          <w:b w:val="0"/>
+          <w:i w:val="0"/>
+        </w:rPr>
         <w:t xml:space="preserve">, and </w:t>
       </w:r>
       <w:r>
         <w:rPr>
           <w:b/>
+          <w:i w:val="0"/>
         </w:rPr>
         <w:t>auto-enables SSL</w:t>
       </w:r>
       <w:r>
+        <w:rPr>
+          <w:b w:val="0"/>
+          <w:i w:val="0"/>
+        </w:rPr>
         <w:t xml:space="preserve"> when the host matches </w:t>
       </w:r>
       <w:r>
         <w:rPr>
           <w:rFonts w:ascii="Consolas" w:hAnsi="Consolas"/>
+          <w:b w:val="0"/>
+          <w:i w:val="0"/>
           <w:sz w:val="19"/>
         </w:rPr>
         <w:t>*.rds.amazonaws.com</w:t>
       </w:r>
       <w:r>
+        <w:rPr>
+          <w:b w:val="0"/>
+          <w:i w:val="0"/>
+        </w:rPr>
         <w:t xml:space="preserve"> (also </w:t>
       </w:r>
       <w:r>
         <w:rPr>
           <w:rFonts w:ascii="Consolas" w:hAnsi="Consolas"/>
+          <w:b w:val="0"/>
+          <w:i w:val="0"/>
           <w:sz w:val="19"/>
         </w:rPr>
         <w:t>*.render.com</w:t>
       </w:r>
       <w:r>
+        <w:rPr>
+          <w:b w:val="0"/>
+          <w:i w:val="0"/>
+        </w:rPr>
         <w:t xml:space="preserve"> / </w:t>
       </w:r>
       <w:r>
         <w:rPr>
           <w:rFonts w:ascii="Consolas" w:hAnsi="Consolas"/>
+          <w:b w:val="0"/>
+          <w:i w:val="0"/>
           <w:sz w:val="19"/>
         </w:rPr>
         <w:t>*.neon.tech</w:t>
       </w:r>
       <w:r>
+        <w:rPr>
+          <w:b w:val="0"/>
+          <w:i w:val="0"/>
+        </w:rPr>
         <w:t>).</w:t>
       </w:r>
     </w:p>
@@ -2922,26 +3693,35 @@
         <w:pStyle w:val="ListBullet"/>
       </w:pPr>
       <w:r>
-        <w:t>Migrations are applied on every deploy by the start command</w:t>
+        <w:rPr>
+          <w:b w:val="0"/>
+          <w:i w:val="0"/>
+        </w:rPr>
+        <w:t>Migrations are applied on every deploy by the start command (</w:t>
+      </w:r>
+      <w:r>
+        <w:rPr>
+          <w:rFonts w:ascii="Consolas" w:hAnsi="Consolas"/>
+          <w:b w:val="0"/>
+          <w:i w:val="0"/>
+          <w:sz w:val="19"/>
+        </w:rPr>
+        <w:t>npx prisma migrate deploy</w:t>
+      </w:r>
+      <w:r>
+        <w:rPr>
+          <w:b w:val="0"/>
+          <w:i w:val="0"/>
+        </w:rPr>
+        <w:t>).</w:t>
       </w:r>
     </w:p>
     <w:p>
       <w:r>
-        <w:t>(</w:t>
-      </w:r>
-      <w:r>
-        <w:rPr>
-          <w:rFonts w:ascii="Consolas" w:hAnsi="Consolas"/>
-          <w:sz w:val="19"/>
-        </w:rPr>
-        <w:t>npx prisma migrate deploy</w:t>
-      </w:r>
-      <w:r>
-        <w:t>).</w:t>
-      </w:r>
-    </w:p>
-    <w:p>
-      <w:r>
+        <w:rPr>
+          <w:b w:val="0"/>
+          <w:i w:val="0"/>
+        </w:rPr>
         <w:t>It holds users/sessions plus all matter data: matters, intake sections, forms, folders, and per-matter task states.</w:t>
       </w:r>
     </w:p>
@@ -2955,34 +3735,68 @@
     </w:p>
     <w:p>
       <w:r>
-        <w:t xml:space="preserve">The connection string is a standard user/password (+ SSL) URL, so nothing expires on a timer *inside the app*. A failure means the credential in </w:t>
+        <w:rPr>
+          <w:b w:val="0"/>
+          <w:i w:val="0"/>
+        </w:rPr>
+        <w:t xml:space="preserve">The connection string is a standard user/password (+ SSL) URL, so nothing expires on a timer </w:t>
+      </w:r>
+      <w:r>
+        <w:rPr>
+          <w:b w:val="0"/>
+          <w:i/>
+        </w:rPr>
+        <w:t>inside the app</w:t>
+      </w:r>
+      <w:r>
+        <w:rPr>
+          <w:b w:val="0"/>
+          <w:i w:val="0"/>
+        </w:rPr>
+        <w:t xml:space="preserve">. A failure means the credential in </w:t>
       </w:r>
       <w:r>
         <w:rPr>
           <w:rFonts w:ascii="Consolas" w:hAnsi="Consolas"/>
+          <w:b w:val="0"/>
+          <w:i w:val="0"/>
           <w:sz w:val="19"/>
         </w:rPr>
         <w:t>DATABASE_URL</w:t>
       </w:r>
       <w:r>
+        <w:rPr>
+          <w:b w:val="0"/>
+          <w:i w:val="0"/>
+        </w:rPr>
         <w:t xml:space="preserve"> stopped working at the AWS side — a </w:t>
       </w:r>
       <w:r>
         <w:rPr>
           <w:b/>
+          <w:i w:val="0"/>
         </w:rPr>
         <w:t>rotated master password</w:t>
       </w:r>
       <w:r>
+        <w:rPr>
+          <w:b w:val="0"/>
+          <w:i w:val="0"/>
+        </w:rPr>
         <w:t xml:space="preserve">, a </w:t>
       </w:r>
       <w:r>
         <w:rPr>
           <w:b/>
+          <w:i w:val="0"/>
         </w:rPr>
         <w:t>revoked/expired IAM database-auth token</w:t>
       </w:r>
       <w:r>
+        <w:rPr>
+          <w:b w:val="0"/>
+          <w:i w:val="0"/>
+        </w:rPr>
         <w:t xml:space="preserve"> (if IAM auth is used, those are valid ~15 min and must be regenerated), an RDS endpoint change, or the security group/SSL requirement changing.</w:t>
       </w:r>
     </w:p>
@@ -2990,6 +3804,7 @@
       <w:r>
         <w:rPr>
           <w:b/>
+          <w:i w:val="0"/>
         </w:rPr>
         <w:t>How to recognize it (symptoms, from the outside in):</w:t>
       </w:r>
@@ -2999,49 +3814,84 @@
         <w:pStyle w:val="ListNumber"/>
       </w:pPr>
       <w:r>
+        <w:rPr>
+          <w:b w:val="0"/>
+          <w:i w:val="0"/>
+        </w:rPr>
         <w:t xml:space="preserve">In the </w:t>
       </w:r>
       <w:r>
         <w:rPr>
           <w:b/>
+          <w:i w:val="0"/>
         </w:rPr>
         <w:t>browser</w:t>
       </w:r>
       <w:r>
-        <w:t>, the app loads the shell but Matters/Forms show "Unable to</w:t>
-      </w:r>
-    </w:p>
-    <w:p>
-      <w:r>
-        <w:t xml:space="preserve">load…", and network calls to </w:t>
+        <w:rPr>
+          <w:b w:val="0"/>
+          <w:i w:val="0"/>
+        </w:rPr>
+        <w:t xml:space="preserve">, the app loads the shell but Matters/Forms show "Unable to load…", and network calls to </w:t>
       </w:r>
       <w:r>
         <w:rPr>
           <w:rFonts w:ascii="Consolas" w:hAnsi="Consolas"/>
+          <w:b w:val="0"/>
+          <w:i w:val="0"/>
           <w:sz w:val="19"/>
         </w:rPr>
         <w:t>…/v1/*</w:t>
       </w:r>
       <w:r>
+        <w:rPr>
+          <w:b w:val="0"/>
+          <w:i w:val="0"/>
+        </w:rPr>
         <w:t xml:space="preserve"> return </w:t>
       </w:r>
       <w:r>
         <w:rPr>
           <w:b/>
+          <w:i w:val="0"/>
         </w:rPr>
         <w:t>500</w:t>
       </w:r>
       <w:r>
-        <w:t xml:space="preserve"> (not 401 — a 401 is a *login/session* problem, i.e. </w:t>
+        <w:rPr>
+          <w:b w:val="0"/>
+          <w:i w:val="0"/>
+        </w:rPr>
+        <w:t xml:space="preserve"> (not 401 — a 401 is a </w:t>
+      </w:r>
+      <w:r>
+        <w:rPr>
+          <w:b w:val="0"/>
+          <w:i/>
+        </w:rPr>
+        <w:t>login/session</w:t>
+      </w:r>
+      <w:r>
+        <w:rPr>
+          <w:b w:val="0"/>
+          <w:i w:val="0"/>
+        </w:rPr>
+        <w:t xml:space="preserve"> problem, i.e. </w:t>
       </w:r>
       <w:r>
         <w:rPr>
           <w:rFonts w:ascii="Consolas" w:hAnsi="Consolas"/>
+          <w:b w:val="0"/>
+          <w:i w:val="0"/>
           <w:sz w:val="19"/>
         </w:rPr>
         <w:t>JWT_SECRET</w:t>
       </w:r>
       <w:r>
+        <w:rPr>
+          <w:b w:val="0"/>
+          <w:i w:val="0"/>
+        </w:rPr>
         <w:t>/cookie, not the DB).</w:t>
       </w:r>
     </w:p>
@@ -3050,70 +3900,104 @@
         <w:pStyle w:val="ListNumber"/>
       </w:pPr>
       <w:r>
+        <w:rPr>
+          <w:b w:val="0"/>
+          <w:i w:val="0"/>
+        </w:rPr>
         <w:t xml:space="preserve">In the </w:t>
       </w:r>
       <w:r>
         <w:rPr>
           <w:b/>
+          <w:i w:val="0"/>
         </w:rPr>
         <w:t>auth-server Render logs</w:t>
       </w:r>
       <w:r>
+        <w:rPr>
+          <w:b w:val="0"/>
+          <w:i w:val="0"/>
+        </w:rPr>
         <w:t xml:space="preserve"> (§ logs below) you'll see Prisma/</w:t>
       </w:r>
       <w:r>
         <w:rPr>
           <w:rFonts w:ascii="Consolas" w:hAnsi="Consolas"/>
+          <w:b w:val="0"/>
+          <w:i w:val="0"/>
           <w:sz w:val="19"/>
         </w:rPr>
         <w:t>pg</w:t>
       </w:r>
       <w:r>
-        <w:t xml:space="preserve"> connection</w:t>
-      </w:r>
-    </w:p>
-    <w:p>
-      <w:r>
-        <w:t xml:space="preserve">errors — e.g. </w:t>
+        <w:rPr>
+          <w:b w:val="0"/>
+          <w:i w:val="0"/>
+        </w:rPr>
+        <w:t xml:space="preserve"> connection errors — e.g. </w:t>
       </w:r>
       <w:r>
         <w:rPr>
           <w:rFonts w:ascii="Consolas" w:hAnsi="Consolas"/>
+          <w:b w:val="0"/>
+          <w:i w:val="0"/>
           <w:sz w:val="19"/>
         </w:rPr>
         <w:t>password authentication failed for user</w:t>
       </w:r>
       <w:r>
+        <w:rPr>
+          <w:b w:val="0"/>
+          <w:i w:val="0"/>
+        </w:rPr>
         <w:t xml:space="preserve">, </w:t>
       </w:r>
       <w:r>
         <w:rPr>
           <w:rFonts w:ascii="Consolas" w:hAnsi="Consolas"/>
+          <w:b w:val="0"/>
+          <w:i w:val="0"/>
           <w:sz w:val="19"/>
         </w:rPr>
         <w:t>no pg_hba.conf entry</w:t>
       </w:r>
       <w:r>
+        <w:rPr>
+          <w:b w:val="0"/>
+          <w:i w:val="0"/>
+        </w:rPr>
         <w:t xml:space="preserve">, </w:t>
       </w:r>
       <w:r>
         <w:rPr>
           <w:rFonts w:ascii="Consolas" w:hAnsi="Consolas"/>
+          <w:b w:val="0"/>
+          <w:i w:val="0"/>
           <w:sz w:val="19"/>
         </w:rPr>
         <w:t>SSL required</w:t>
       </w:r>
       <w:r>
+        <w:rPr>
+          <w:b w:val="0"/>
+          <w:i w:val="0"/>
+        </w:rPr>
         <w:t xml:space="preserve">, </w:t>
       </w:r>
       <w:r>
         <w:rPr>
           <w:rFonts w:ascii="Consolas" w:hAnsi="Consolas"/>
+          <w:b w:val="0"/>
+          <w:i w:val="0"/>
           <w:sz w:val="19"/>
         </w:rPr>
         <w:t>getaddrinfo ENOTFOUND …rds.amazonaws.com</w:t>
       </w:r>
       <w:r>
+        <w:rPr>
+          <w:b w:val="0"/>
+          <w:i w:val="0"/>
+        </w:rPr>
         <w:t>, or connection timeouts. The Flask service and its AI chat keep working (it has no DB), which is a quick way to confirm the fault is DB-only.</w:t>
       </w:r>
     </w:p>
@@ -3122,57 +4006,86 @@
         <w:pStyle w:val="ListNumber"/>
       </w:pPr>
       <w:r>
+        <w:rPr>
+          <w:b w:val="0"/>
+          <w:i w:val="0"/>
+        </w:rPr>
         <w:t xml:space="preserve">If the start command can't migrate, the </w:t>
       </w:r>
       <w:r>
         <w:rPr>
           <w:b/>
+          <w:i w:val="0"/>
         </w:rPr>
         <w:t>deploy itself fails</w:t>
       </w:r>
       <w:r>
-        <w:t xml:space="preserve"> at</w:t>
+        <w:rPr>
+          <w:b w:val="0"/>
+          <w:i w:val="0"/>
+        </w:rPr>
+        <w:t xml:space="preserve"> at </w:t>
+      </w:r>
+      <w:r>
+        <w:rPr>
+          <w:rFonts w:ascii="Consolas" w:hAnsi="Consolas"/>
+          <w:b w:val="0"/>
+          <w:i w:val="0"/>
+          <w:sz w:val="19"/>
+        </w:rPr>
+        <w:t>prisma migrate deploy</w:t>
+      </w:r>
+      <w:r>
+        <w:rPr>
+          <w:b w:val="0"/>
+          <w:i w:val="0"/>
+        </w:rPr>
+        <w:t>.</w:t>
       </w:r>
     </w:p>
     <w:p>
       <w:r>
         <w:rPr>
+          <w:b/>
+          <w:i w:val="0"/>
+        </w:rPr>
+        <w:t>Where to fix it:</w:t>
+      </w:r>
+      <w:r>
+        <w:rPr>
+          <w:b w:val="0"/>
+          <w:i w:val="0"/>
+        </w:rPr>
+        <w:t xml:space="preserve"> update </w:t>
+      </w:r>
+      <w:r>
+        <w:rPr>
           <w:rFonts w:ascii="Consolas" w:hAnsi="Consolas"/>
+          <w:b w:val="0"/>
+          <w:i w:val="0"/>
           <w:sz w:val="19"/>
         </w:rPr>
-        <w:t>prisma migrate deploy</w:t>
-      </w:r>
-      <w:r>
-        <w:t>.</w:t>
-      </w:r>
-    </w:p>
-    <w:p>
+        <w:t>DATABASE_URL</w:t>
+      </w:r>
+      <w:r>
+        <w:rPr>
+          <w:b w:val="0"/>
+          <w:i w:val="0"/>
+        </w:rPr>
+        <w:t xml:space="preserve"> in </w:t>
+      </w:r>
       <w:r>
         <w:rPr>
           <w:b/>
-        </w:rPr>
-        <w:t>Where to fix it:</w:t>
-      </w:r>
-      <w:r>
-        <w:t xml:space="preserve"> update </w:t>
-      </w:r>
-      <w:r>
-        <w:rPr>
-          <w:rFonts w:ascii="Consolas" w:hAnsi="Consolas"/>
-          <w:sz w:val="19"/>
-        </w:rPr>
-        <w:t>DATABASE_URL</w:t>
-      </w:r>
-      <w:r>
-        <w:t xml:space="preserve"> in </w:t>
-      </w:r>
-      <w:r>
-        <w:rPr>
-          <w:b/>
+          <w:i w:val="0"/>
         </w:rPr>
         <w:t>Render → Calculator-code-auth → Environment</w:t>
       </w:r>
       <w:r>
+        <w:rPr>
+          <w:b w:val="0"/>
+          <w:i w:val="0"/>
+        </w:rPr>
         <w:t xml:space="preserve"> with the new/rotated credential (or a freshly minted IAM token), verify the RDS endpoint/port and that its security group allows Render's egress, and redeploy.</w:t>
       </w:r>
     </w:p>
@@ -3181,40 +4094,26 @@
         <w:pStyle w:val="IntenseQuote"/>
       </w:pPr>
       <w:r>
-        <w:t>The exact AWS auth mechanism (static password vs. IAM database authentication vs.</w:t>
-      </w:r>
-    </w:p>
-    <w:p>
-      <w:pPr>
-        <w:pStyle w:val="IntenseQuote"/>
-      </w:pPr>
-      <w:r>
-        <w:t>Secrets Manager rotation) isn't encoded in this repo — confirm which one this RDS</w:t>
-      </w:r>
-    </w:p>
-    <w:p>
-      <w:pPr>
-        <w:pStyle w:val="IntenseQuote"/>
-      </w:pPr>
-      <w:r>
-        <w:t>instance uses so the runbook above can name the precise regeneration step. The</w:t>
-      </w:r>
-    </w:p>
-    <w:p>
-      <w:pPr>
-        <w:pStyle w:val="IntenseQuote"/>
-      </w:pPr>
-      <w:r>
-        <w:t xml:space="preserve">symptoms and the "update </w:t>
+        <w:rPr>
+          <w:b w:val="0"/>
+          <w:i w:val="0"/>
+        </w:rPr>
+        <w:t xml:space="preserve">The exact AWS auth mechanism (static password vs. IAM database authentication vs. Secrets Manager rotation) isn't encoded in this repo — confirm which one this RDS instance uses so the runbook above can name the precise regeneration step. The symptoms and the "update </w:t>
       </w:r>
       <w:r>
         <w:rPr>
           <w:rFonts w:ascii="Consolas" w:hAnsi="Consolas"/>
+          <w:b w:val="0"/>
+          <w:i w:val="0"/>
           <w:sz w:val="19"/>
         </w:rPr>
         <w:t>DATABASE_URL</w:t>
       </w:r>
       <w:r>
+        <w:rPr>
+          <w:b w:val="0"/>
+          <w:i w:val="0"/>
+        </w:rPr>
         <w:t xml:space="preserve"> + redeploy" fix hold either way.</w:t>
       </w:r>
     </w:p>
@@ -3246,6 +4145,7 @@
             <w:r>
               <w:rPr>
                 <w:b/>
+                <w:i w:val="0"/>
               </w:rPr>
               <w:t>You're debugging…</w:t>
             </w:r>
@@ -3259,6 +4159,7 @@
             <w:r>
               <w:rPr>
                 <w:b/>
+                <w:i w:val="0"/>
               </w:rPr>
               <w:t>Go to</w:t>
             </w:r>
@@ -3272,11 +4173,16 @@
           </w:tcPr>
           <w:p>
             <w:r>
+              <w:rPr>
+                <w:b w:val="0"/>
+                <w:i w:val="0"/>
+              </w:rPr>
               <w:t xml:space="preserve">A page not loading, save failing, login issues, </w:t>
             </w:r>
             <w:r>
               <w:rPr>
                 <w:b/>
+                <w:i w:val="0"/>
               </w:rPr>
               <w:t>DB errors</w:t>
             </w:r>
@@ -3290,19 +4196,29 @@
             <w:r>
               <w:rPr>
                 <w:b/>
+                <w:i w:val="0"/>
               </w:rPr>
               <w:t>Render → Calculator-code-auth → Logs</w:t>
             </w:r>
             <w:r>
+              <w:rPr>
+                <w:b w:val="0"/>
+                <w:i w:val="0"/>
+              </w:rPr>
               <w:t xml:space="preserve"> (and </w:t>
             </w:r>
             <w:r>
               <w:rPr>
                 <w:b/>
+                <w:i w:val="0"/>
               </w:rPr>
               <w:t>Events</w:t>
             </w:r>
             <w:r>
+              <w:rPr>
+                <w:b w:val="0"/>
+                <w:i w:val="0"/>
+              </w:rPr>
               <w:t xml:space="preserve"> for deploy/crash history). This is the busiest log.</w:t>
             </w:r>
           </w:p>
@@ -3315,6 +4231,10 @@
           </w:tcPr>
           <w:p>
             <w:r>
+              <w:rPr>
+                <w:b w:val="0"/>
+                <w:i w:val="0"/>
+              </w:rPr>
               <w:t>AI chat not replying, report PDF not generating, Anthropic/model errors</w:t>
             </w:r>
           </w:p>
@@ -3327,10 +4247,15 @@
             <w:r>
               <w:rPr>
                 <w:b/>
+                <w:i w:val="0"/>
               </w:rPr>
               <w:t>Render → Calculator-code → Logs</w:t>
             </w:r>
             <w:r>
+              <w:rPr>
+                <w:b w:val="0"/>
+                <w:i w:val="0"/>
+              </w:rPr>
               <w:t>. Look for Anthropic 401/429 or model-name errors.</w:t>
             </w:r>
           </w:p>
@@ -3343,6 +4268,10 @@
           </w:tcPr>
           <w:p>
             <w:r>
+              <w:rPr>
+                <w:b w:val="0"/>
+                <w:i w:val="0"/>
+              </w:rPr>
               <w:t>Email not arriving (verify/reset)</w:t>
             </w:r>
           </w:p>
@@ -3355,40 +4284,63 @@
             <w:r>
               <w:rPr>
                 <w:b/>
+                <w:i w:val="0"/>
               </w:rPr>
               <w:t>Render → Calculator-code-auth → Logs</w:t>
             </w:r>
             <w:r>
+              <w:rPr>
+                <w:b w:val="0"/>
+                <w:i w:val="0"/>
+              </w:rPr>
               <w:t xml:space="preserve"> — search for </w:t>
             </w:r>
             <w:r>
               <w:rPr>
                 <w:rFonts w:ascii="Consolas" w:hAnsi="Consolas"/>
+                <w:b w:val="0"/>
+                <w:i w:val="0"/>
                 <w:sz w:val="19"/>
               </w:rPr>
               <w:t>Microsoft Graph</w:t>
             </w:r>
             <w:r>
+              <w:rPr>
+                <w:b w:val="0"/>
+                <w:i w:val="0"/>
+              </w:rPr>
               <w:t xml:space="preserve">. A </w:t>
             </w:r>
             <w:r>
               <w:rPr>
                 <w:rFonts w:ascii="Consolas" w:hAnsi="Consolas"/>
+                <w:b w:val="0"/>
+                <w:i w:val="0"/>
                 <w:sz w:val="19"/>
               </w:rPr>
               <w:t>401</w:t>
             </w:r>
             <w:r>
+              <w:rPr>
+                <w:b w:val="0"/>
+                <w:i w:val="0"/>
+              </w:rPr>
               <w:t xml:space="preserve"> there = expired </w:t>
             </w:r>
             <w:r>
               <w:rPr>
                 <w:rFonts w:ascii="Consolas" w:hAnsi="Consolas"/>
+                <w:b w:val="0"/>
+                <w:i w:val="0"/>
                 <w:sz w:val="19"/>
               </w:rPr>
               <w:t>EMAIL_MICROSOFT_CLIENT_SECRET</w:t>
             </w:r>
             <w:r>
+              <w:rPr>
+                <w:b w:val="0"/>
+                <w:i w:val="0"/>
+              </w:rPr>
               <w:t>.</w:t>
             </w:r>
           </w:p>
@@ -3401,6 +4353,10 @@
           </w:tcPr>
           <w:p>
             <w:r>
+              <w:rPr>
+                <w:b w:val="0"/>
+                <w:i w:val="0"/>
+              </w:rPr>
               <w:t>Build failed, wrong env var baked in, routing/404 on refresh</w:t>
             </w:r>
           </w:p>
@@ -3413,19 +4369,29 @@
             <w:r>
               <w:rPr>
                 <w:b/>
+                <w:i w:val="0"/>
               </w:rPr>
               <w:t>Vercel → calculator-ai-ui → Deployments</w:t>
             </w:r>
             <w:r>
+              <w:rPr>
+                <w:b w:val="0"/>
+                <w:i w:val="0"/>
+              </w:rPr>
               <w:t xml:space="preserve"> (build logs) and </w:t>
             </w:r>
             <w:r>
               <w:rPr>
                 <w:b/>
+                <w:i w:val="0"/>
               </w:rPr>
               <w:t>Logs/Observability</w:t>
             </w:r>
             <w:r>
+              <w:rPr>
+                <w:b w:val="0"/>
+                <w:i w:val="0"/>
+              </w:rPr>
               <w:t xml:space="preserve"> (runtime/edge). Remember CRA inlines env vars at build — rebuild after changing them.</w:t>
             </w:r>
           </w:p>
@@ -3438,6 +4404,10 @@
           </w:tcPr>
           <w:p>
             <w:r>
+              <w:rPr>
+                <w:b w:val="0"/>
+                <w:i w:val="0"/>
+              </w:rPr>
               <w:t>Slow first request after idle</w:t>
             </w:r>
           </w:p>
@@ -3448,15 +4418,24 @@
           </w:tcPr>
           <w:p>
             <w:r>
+              <w:rPr>
+                <w:b w:val="0"/>
+                <w:i w:val="0"/>
+              </w:rPr>
               <w:t xml:space="preserve">Expected Free-tier cold start on the Render services; check </w:t>
             </w:r>
             <w:r>
               <w:rPr>
                 <w:b/>
+                <w:i w:val="0"/>
               </w:rPr>
               <w:t>Events</w:t>
             </w:r>
             <w:r>
+              <w:rPr>
+                <w:b w:val="0"/>
+                <w:i w:val="0"/>
+              </w:rPr>
               <w:t xml:space="preserve"> to confirm a spin-up, not a crash.</w:t>
             </w:r>
           </w:p>
@@ -3469,6 +4448,10 @@
           </w:tcPr>
           <w:p>
             <w:r>
+              <w:rPr>
+                <w:b w:val="0"/>
+                <w:i w:val="0"/>
+              </w:rPr>
               <w:t>Database-level (slow queries, storage, connections)</w:t>
             </w:r>
           </w:p>
@@ -3481,28 +4464,43 @@
             <w:r>
               <w:rPr>
                 <w:b/>
+                <w:i w:val="0"/>
               </w:rPr>
               <w:t>AWS RDS console</w:t>
             </w:r>
             <w:r>
+              <w:rPr>
+                <w:b w:val="0"/>
+                <w:i w:val="0"/>
+              </w:rPr>
               <w:t xml:space="preserve"> → the instance's </w:t>
             </w:r>
             <w:r>
               <w:rPr>
                 <w:b/>
+                <w:i w:val="0"/>
               </w:rPr>
               <w:t>Monitoring</w:t>
             </w:r>
             <w:r>
+              <w:rPr>
+                <w:b w:val="0"/>
+                <w:i w:val="0"/>
+              </w:rPr>
               <w:t xml:space="preserve">/CloudWatch and </w:t>
             </w:r>
             <w:r>
               <w:rPr>
                 <w:b/>
+                <w:i w:val="0"/>
               </w:rPr>
               <w:t>Logs &amp; events</w:t>
             </w:r>
             <w:r>
+              <w:rPr>
+                <w:b w:val="0"/>
+                <w:i w:val="0"/>
+              </w:rPr>
               <w:t>.</w:t>
             </w:r>
           </w:p>
@@ -3512,24 +4510,38 @@
     <w:p/>
     <w:p>
       <w:r>
+        <w:rPr>
+          <w:b w:val="0"/>
+          <w:i w:val="0"/>
+        </w:rPr>
         <w:t xml:space="preserve">Both Render services also have </w:t>
       </w:r>
       <w:r>
         <w:rPr>
           <w:b/>
+          <w:i w:val="0"/>
         </w:rPr>
         <w:t>Shell</w:t>
       </w:r>
       <w:r>
+        <w:rPr>
+          <w:b w:val="0"/>
+          <w:i w:val="0"/>
+        </w:rPr>
         <w:t xml:space="preserve"> and </w:t>
       </w:r>
       <w:r>
         <w:rPr>
           <w:b/>
+          <w:i w:val="0"/>
         </w:rPr>
         <w:t>Metrics</w:t>
       </w:r>
       <w:r>
+        <w:rPr>
+          <w:b w:val="0"/>
+          <w:i w:val="0"/>
+        </w:rPr>
         <w:t xml:space="preserve"> tabs; the auth-server's Shell is handy for running one-off Prisma commands against the live DB.</w:t>
       </w:r>
     </w:p>
@@ -3549,31 +4561,45 @@
       <w:r>
         <w:rPr>
           <w:b/>
+          <w:i w:val="0"/>
         </w:rPr>
         <w:t>Sign in / load matters / save a form</w:t>
       </w:r>
       <w:r>
+        <w:rPr>
+          <w:b w:val="0"/>
+          <w:i w:val="0"/>
+        </w:rPr>
         <w:t xml:space="preserve"> → browser → </w:t>
       </w:r>
       <w:r>
         <w:rPr>
           <w:rFonts w:ascii="Consolas" w:hAnsi="Consolas"/>
+          <w:b w:val="0"/>
+          <w:i w:val="0"/>
           <w:sz w:val="19"/>
         </w:rPr>
         <w:t>REACT_APP_API_BASE_URL</w:t>
       </w:r>
-    </w:p>
-    <w:p>
-      <w:r>
-        <w:t xml:space="preserve">(auth-server on Render) → Prisma → </w:t>
+      <w:r>
+        <w:rPr>
+          <w:b w:val="0"/>
+          <w:i w:val="0"/>
+        </w:rPr>
+        <w:t xml:space="preserve"> (auth-server on Render) → Prisma → </w:t>
       </w:r>
       <w:r>
         <w:rPr>
           <w:b/>
+          <w:i w:val="0"/>
         </w:rPr>
         <w:t>AWS RDS</w:t>
       </w:r>
       <w:r>
+        <w:rPr>
+          <w:b w:val="0"/>
+          <w:i w:val="0"/>
+        </w:rPr>
         <w:t>. Response comes back through the same chain.</w:t>
       </w:r>
     </w:p>
@@ -3584,30 +4610,37 @@
       <w:r>
         <w:rPr>
           <w:b/>
+          <w:i w:val="0"/>
         </w:rPr>
         <w:t>Ask the AI / download a support report</w:t>
       </w:r>
       <w:r>
+        <w:rPr>
+          <w:b w:val="0"/>
+          <w:i w:val="0"/>
+        </w:rPr>
         <w:t xml:space="preserve"> → browser → </w:t>
       </w:r>
       <w:r>
         <w:rPr>
           <w:rFonts w:ascii="Consolas" w:hAnsi="Consolas"/>
+          <w:b w:val="0"/>
+          <w:i w:val="0"/>
           <w:sz w:val="19"/>
         </w:rPr>
         <w:t>CALCULATOR_API</w:t>
       </w:r>
       <w:r>
-        <w:t xml:space="preserve"> (Flask on</w:t>
-      </w:r>
-    </w:p>
-    <w:p>
-      <w:r>
-        <w:t xml:space="preserve">Render) → Anthropic → PDF/text back. </w:t>
+        <w:rPr>
+          <w:b w:val="0"/>
+          <w:i w:val="0"/>
+        </w:rPr>
+        <w:t xml:space="preserve"> (Flask on Render) → Anthropic → PDF/text back. </w:t>
       </w:r>
       <w:r>
         <w:rPr>
           <w:b/>
+          <w:i w:val="0"/>
         </w:rPr>
         <w:t>No database involved.</w:t>
       </w:r>
@@ -3619,35 +4652,60 @@
       <w:r>
         <w:rPr>
           <w:b/>
+          <w:i w:val="0"/>
         </w:rPr>
         <w:t>Sign up / reset password</w:t>
       </w:r>
       <w:r>
-        <w:t xml:space="preserve"> → auth-server writes the user + calls **Microsoft</w:t>
+        <w:rPr>
+          <w:b w:val="0"/>
+          <w:i w:val="0"/>
+        </w:rPr>
+        <w:t xml:space="preserve"> → auth-server writes the user + calls </w:t>
+      </w:r>
+      <w:r>
+        <w:rPr>
+          <w:b/>
+          <w:i w:val="0"/>
+        </w:rPr>
+        <w:t>Microsoft Graph</w:t>
+      </w:r>
+      <w:r>
+        <w:rPr>
+          <w:b w:val="0"/>
+          <w:i w:val="0"/>
+        </w:rPr>
+        <w:t xml:space="preserve"> to email the link (whose base is </w:t>
+      </w:r>
+      <w:r>
+        <w:rPr>
+          <w:rFonts w:ascii="Consolas" w:hAnsi="Consolas"/>
+          <w:b w:val="0"/>
+          <w:i w:val="0"/>
+          <w:sz w:val="19"/>
+        </w:rPr>
+        <w:t>FRONTEND_URL</w:t>
+      </w:r>
+      <w:r>
+        <w:rPr>
+          <w:b w:val="0"/>
+          <w:i w:val="0"/>
+        </w:rPr>
+        <w:t>).</w:t>
       </w:r>
     </w:p>
     <w:p>
       <w:r>
-        <w:t xml:space="preserve">Graph** to email the link (whose base is </w:t>
-      </w:r>
-      <w:r>
-        <w:rPr>
-          <w:rFonts w:ascii="Consolas" w:hAnsi="Consolas"/>
-          <w:sz w:val="19"/>
-        </w:rPr>
-        <w:t>FRONTEND_URL</w:t>
-      </w:r>
-      <w:r>
-        <w:t>).</w:t>
-      </w:r>
-    </w:p>
-    <w:p>
-      <w:r>
+        <w:rPr>
+          <w:b w:val="0"/>
+          <w:i w:val="0"/>
+        </w:rPr>
         <w:t xml:space="preserve">So a useful triage shortcut: </w:t>
       </w:r>
       <w:r>
         <w:rPr>
           <w:b/>
+          <w:i w:val="0"/>
         </w:rPr>
         <w:t>if the AI chat works but data won't load, it's the auth-server or the DB; if data loads but AI is dead, it's the Flask service or Anthropic.</w:t>
       </w:r>
@@ -3666,25 +4724,42 @@
         <w:pStyle w:val="ListNumber"/>
       </w:pPr>
       <w:r>
+        <w:rPr>
+          <w:b w:val="0"/>
+          <w:i w:val="0"/>
+        </w:rPr>
         <w:t xml:space="preserve">Merge to </w:t>
       </w:r>
       <w:r>
         <w:rPr>
+          <w:rFonts w:ascii="Consolas" w:hAnsi="Consolas"/>
           <w:b/>
-        </w:rPr>
-        <w:t>`main`</w:t>
-      </w:r>
-      <w:r>
+          <w:i w:val="0"/>
+          <w:sz w:val="19"/>
+        </w:rPr>
+        <w:t>main</w:t>
+      </w:r>
+      <w:r>
+        <w:rPr>
+          <w:b w:val="0"/>
+          <w:i w:val="0"/>
+        </w:rPr>
         <w:t xml:space="preserve"> on </w:t>
       </w:r>
       <w:r>
         <w:rPr>
           <w:rFonts w:ascii="Consolas" w:hAnsi="Consolas"/>
+          <w:b w:val="0"/>
+          <w:i w:val="0"/>
           <w:sz w:val="19"/>
         </w:rPr>
         <w:t>cloudactai/Calculator-code</w:t>
       </w:r>
       <w:r>
+        <w:rPr>
+          <w:b w:val="0"/>
+          <w:i w:val="0"/>
+        </w:rPr>
         <w:t>.</w:t>
       </w:r>
     </w:p>
@@ -3695,20 +4770,31 @@
       <w:r>
         <w:rPr>
           <w:b/>
+          <w:i w:val="0"/>
         </w:rPr>
         <w:t>Vercel</w:t>
       </w:r>
       <w:r>
+        <w:rPr>
+          <w:b w:val="0"/>
+          <w:i w:val="0"/>
+        </w:rPr>
         <w:t xml:space="preserve"> auto-builds the frontend from </w:t>
       </w:r>
       <w:r>
         <w:rPr>
           <w:rFonts w:ascii="Consolas" w:hAnsi="Consolas"/>
+          <w:b w:val="0"/>
+          <w:i w:val="0"/>
           <w:sz w:val="19"/>
         </w:rPr>
         <w:t>cloudact-ui/</w:t>
       </w:r>
       <w:r>
+        <w:rPr>
+          <w:b w:val="0"/>
+          <w:i w:val="0"/>
+        </w:rPr>
         <w:t>.</w:t>
       </w:r>
     </w:p>
@@ -3719,34 +4805,45 @@
       <w:r>
         <w:rPr>
           <w:b/>
+          <w:i w:val="0"/>
         </w:rPr>
         <w:t>Render</w:t>
       </w:r>
       <w:r>
-        <w:t xml:space="preserve"> builds both backend services from the same repo (each service has its own</w:t>
-      </w:r>
-    </w:p>
-    <w:p>
-      <w:r>
-        <w:t xml:space="preserve">root/branch config). The auth-server runs </w:t>
+        <w:rPr>
+          <w:b w:val="0"/>
+          <w:i w:val="0"/>
+        </w:rPr>
+        <w:t xml:space="preserve"> builds both backend services from the same repo (each service has its own root/branch config). The auth-server runs </w:t>
       </w:r>
       <w:r>
         <w:rPr>
           <w:rFonts w:ascii="Consolas" w:hAnsi="Consolas"/>
+          <w:b w:val="0"/>
+          <w:i w:val="0"/>
           <w:sz w:val="19"/>
         </w:rPr>
         <w:t>prisma migrate deploy</w:t>
       </w:r>
       <w:r>
+        <w:rPr>
+          <w:b w:val="0"/>
+          <w:i w:val="0"/>
+        </w:rPr>
         <w:t xml:space="preserve"> on boot. You can also </w:t>
       </w:r>
       <w:r>
         <w:rPr>
           <w:b/>
+          <w:i w:val="0"/>
         </w:rPr>
         <w:t>Manual Deploy</w:t>
       </w:r>
       <w:r>
+        <w:rPr>
+          <w:b w:val="0"/>
+          <w:i w:val="0"/>
+        </w:rPr>
         <w:t xml:space="preserve"> from each Render service.</w:t>
       </w:r>
     </w:p>
@@ -3755,36 +4852,54 @@
         <w:pStyle w:val="ListNumber"/>
       </w:pPr>
       <w:r>
+        <w:rPr>
+          <w:b w:val="0"/>
+          <w:i w:val="0"/>
+        </w:rPr>
         <w:t xml:space="preserve">Sanity check: the commit hash shown as </w:t>
       </w:r>
       <w:r>
         <w:rPr>
           <w:b/>
+          <w:i w:val="0"/>
         </w:rPr>
         <w:t>Live</w:t>
       </w:r>
       <w:r>
-        <w:t xml:space="preserve"> on both Render services and as the</w:t>
-      </w:r>
-    </w:p>
-    <w:p>
+        <w:rPr>
+          <w:b w:val="0"/>
+          <w:i w:val="0"/>
+        </w:rPr>
+        <w:t xml:space="preserve"> on both Render services and as the </w:t>
+      </w:r>
       <w:r>
         <w:rPr>
           <w:b/>
+          <w:i w:val="0"/>
         </w:rPr>
         <w:t>Production Deployment</w:t>
       </w:r>
       <w:r>
+        <w:rPr>
+          <w:b w:val="0"/>
+          <w:i w:val="0"/>
+        </w:rPr>
         <w:t xml:space="preserve"> on Vercel should match (they were all </w:t>
       </w:r>
       <w:r>
         <w:rPr>
           <w:rFonts w:ascii="Consolas" w:hAnsi="Consolas"/>
+          <w:b w:val="0"/>
+          <w:i w:val="0"/>
           <w:sz w:val="19"/>
         </w:rPr>
         <w:t>e6e814b</w:t>
       </w:r>
       <w:r>
+        <w:rPr>
+          <w:b w:val="0"/>
+          <w:i w:val="0"/>
+        </w:rPr>
         <w:t xml:space="preserve"> in the screenshots).</w:t>
       </w:r>
     </w:p>
@@ -3816,6 +4931,7 @@
             <w:r>
               <w:rPr>
                 <w:b/>
+                <w:i w:val="0"/>
               </w:rPr>
               <w:t>Thing</w:t>
             </w:r>
@@ -3829,6 +4945,7 @@
             <w:r>
               <w:rPr>
                 <w:b/>
+                <w:i w:val="0"/>
               </w:rPr>
               <w:t>Value</w:t>
             </w:r>
@@ -3842,6 +4959,10 @@
           </w:tcPr>
           <w:p>
             <w:r>
+              <w:rPr>
+                <w:b w:val="0"/>
+                <w:i w:val="0"/>
+              </w:rPr>
               <w:t>Repo</w:t>
             </w:r>
           </w:p>
@@ -3854,16 +4975,24 @@
             <w:r>
               <w:rPr>
                 <w:rFonts w:ascii="Consolas" w:hAnsi="Consolas"/>
+                <w:b w:val="0"/>
+                <w:i w:val="0"/>
                 <w:sz w:val="19"/>
               </w:rPr>
               <w:t>cloudactai/Calculator-code</w:t>
             </w:r>
             <w:r>
+              <w:rPr>
+                <w:b w:val="0"/>
+                <w:i w:val="0"/>
+              </w:rPr>
               <w:t xml:space="preserve">, branch </w:t>
             </w:r>
             <w:r>
               <w:rPr>
                 <w:rFonts w:ascii="Consolas" w:hAnsi="Consolas"/>
+                <w:b w:val="0"/>
+                <w:i w:val="0"/>
                 <w:sz w:val="19"/>
               </w:rPr>
               <w:t>main</w:t>
@@ -3878,6 +5007,10 @@
           </w:tcPr>
           <w:p>
             <w:r>
+              <w:rPr>
+                <w:b w:val="0"/>
+                <w:i w:val="0"/>
+              </w:rPr>
               <w:t>Frontend (Vercel)</w:t>
             </w:r>
           </w:p>
@@ -3890,16 +5023,24 @@
             <w:r>
               <w:rPr>
                 <w:rFonts w:ascii="Consolas" w:hAnsi="Consolas"/>
+                <w:b w:val="0"/>
+                <w:i w:val="0"/>
                 <w:sz w:val="19"/>
               </w:rPr>
               <w:t>calculator-ai-ui</w:t>
             </w:r>
             <w:r>
+              <w:rPr>
+                <w:b w:val="0"/>
+                <w:i w:val="0"/>
+              </w:rPr>
               <w:t xml:space="preserve"> → </w:t>
             </w:r>
             <w:r>
               <w:rPr>
                 <w:rFonts w:ascii="Consolas" w:hAnsi="Consolas"/>
+                <w:b w:val="0"/>
+                <w:i w:val="0"/>
                 <w:sz w:val="19"/>
               </w:rPr>
               <w:t>app.cloudforlawfirms.com</w:t>
@@ -3914,6 +5055,10 @@
           </w:tcPr>
           <w:p>
             <w:r>
+              <w:rPr>
+                <w:b w:val="0"/>
+                <w:i w:val="0"/>
+              </w:rPr>
               <w:t>Auth/data API (Render)</w:t>
             </w:r>
           </w:p>
@@ -3926,26 +5071,40 @@
             <w:r>
               <w:rPr>
                 <w:rFonts w:ascii="Consolas" w:hAnsi="Consolas"/>
+                <w:b w:val="0"/>
+                <w:i w:val="0"/>
                 <w:sz w:val="19"/>
               </w:rPr>
               <w:t>Calculator-code-auth</w:t>
             </w:r>
             <w:r>
+              <w:rPr>
+                <w:b w:val="0"/>
+                <w:i w:val="0"/>
+              </w:rPr>
               <w:t xml:space="preserve"> → </w:t>
             </w:r>
             <w:r>
               <w:rPr>
                 <w:rFonts w:ascii="Consolas" w:hAnsi="Consolas"/>
+                <w:b w:val="0"/>
+                <w:i w:val="0"/>
                 <w:sz w:val="19"/>
               </w:rPr>
               <w:t>calculator-code-auth.onrender.com</w:t>
             </w:r>
             <w:r>
+              <w:rPr>
+                <w:b w:val="0"/>
+                <w:i w:val="0"/>
+              </w:rPr>
               <w:t xml:space="preserve"> · </w:t>
             </w:r>
             <w:r>
               <w:rPr>
                 <w:rFonts w:ascii="Consolas" w:hAnsi="Consolas"/>
+                <w:b w:val="0"/>
+                <w:i w:val="0"/>
                 <w:sz w:val="19"/>
               </w:rPr>
               <w:t>srv-d939g4vavr4c73bma26g</w:t>
@@ -3960,6 +5119,10 @@
           </w:tcPr>
           <w:p>
             <w:r>
+              <w:rPr>
+                <w:b w:val="0"/>
+                <w:i w:val="0"/>
+              </w:rPr>
               <w:t>AI/report API (Render)</w:t>
             </w:r>
           </w:p>
@@ -3972,26 +5135,40 @@
             <w:r>
               <w:rPr>
                 <w:rFonts w:ascii="Consolas" w:hAnsi="Consolas"/>
+                <w:b w:val="0"/>
+                <w:i w:val="0"/>
                 <w:sz w:val="19"/>
               </w:rPr>
               <w:t>Calculator-code</w:t>
             </w:r>
             <w:r>
+              <w:rPr>
+                <w:b w:val="0"/>
+                <w:i w:val="0"/>
+              </w:rPr>
               <w:t xml:space="preserve"> → </w:t>
             </w:r>
             <w:r>
               <w:rPr>
                 <w:rFonts w:ascii="Consolas" w:hAnsi="Consolas"/>
+                <w:b w:val="0"/>
+                <w:i w:val="0"/>
                 <w:sz w:val="19"/>
               </w:rPr>
               <w:t>calculator-code-x2b4.onrender.com</w:t>
             </w:r>
             <w:r>
+              <w:rPr>
+                <w:b w:val="0"/>
+                <w:i w:val="0"/>
+              </w:rPr>
               <w:t xml:space="preserve"> · </w:t>
             </w:r>
             <w:r>
               <w:rPr>
                 <w:rFonts w:ascii="Consolas" w:hAnsi="Consolas"/>
+                <w:b w:val="0"/>
+                <w:i w:val="0"/>
                 <w:sz w:val="19"/>
               </w:rPr>
               <w:t>srv-d8c47m0js32c7384tscg</w:t>
@@ -4006,6 +5183,10 @@
           </w:tcPr>
           <w:p>
             <w:r>
+              <w:rPr>
+                <w:b w:val="0"/>
+                <w:i w:val="0"/>
+              </w:rPr>
               <w:t>Database</w:t>
             </w:r>
           </w:p>
@@ -4016,25 +5197,40 @@
           </w:tcPr>
           <w:p>
             <w:r>
+              <w:rPr>
+                <w:b w:val="0"/>
+                <w:i w:val="0"/>
+              </w:rPr>
               <w:t xml:space="preserve">PostgreSQL on </w:t>
             </w:r>
             <w:r>
               <w:rPr>
                 <w:b/>
+                <w:i w:val="0"/>
               </w:rPr>
               <w:t>AWS RDS</w:t>
             </w:r>
             <w:r>
+              <w:rPr>
+                <w:b w:val="0"/>
+                <w:i w:val="0"/>
+              </w:rPr>
               <w:t xml:space="preserve"> (via </w:t>
             </w:r>
             <w:r>
               <w:rPr>
                 <w:rFonts w:ascii="Consolas" w:hAnsi="Consolas"/>
+                <w:b w:val="0"/>
+                <w:i w:val="0"/>
                 <w:sz w:val="19"/>
               </w:rPr>
               <w:t>DATABASE_URL</w:t>
             </w:r>
             <w:r>
+              <w:rPr>
+                <w:b w:val="0"/>
+                <w:i w:val="0"/>
+              </w:rPr>
               <w:t>)</w:t>
             </w:r>
           </w:p>
@@ -4047,6 +5243,10 @@
           </w:tcPr>
           <w:p>
             <w:r>
+              <w:rPr>
+                <w:b w:val="0"/>
+                <w:i w:val="0"/>
+              </w:rPr>
               <w:t>Email</w:t>
             </w:r>
           </w:p>
@@ -4057,21 +5257,33 @@
           </w:tcPr>
           <w:p>
             <w:r>
+              <w:rPr>
+                <w:b w:val="0"/>
+                <w:i w:val="0"/>
+              </w:rPr>
               <w:t>Microsoft Graph (</w:t>
             </w:r>
             <w:r>
               <w:rPr>
                 <w:rFonts w:ascii="Consolas" w:hAnsi="Consolas"/>
+                <w:b w:val="0"/>
+                <w:i w:val="0"/>
                 <w:sz w:val="19"/>
               </w:rPr>
               <w:t>EMAIL_MICROSOFT_*</w:t>
             </w:r>
             <w:r>
+              <w:rPr>
+                <w:b w:val="0"/>
+                <w:i w:val="0"/>
+              </w:rPr>
               <w:t xml:space="preserve">), sender </w:t>
             </w:r>
             <w:r>
               <w:rPr>
                 <w:rFonts w:ascii="Consolas" w:hAnsi="Consolas"/>
+                <w:b w:val="0"/>
+                <w:i w:val="0"/>
                 <w:sz w:val="19"/>
               </w:rPr>
               <w:t>notifications@cloudforlawfirms.com</w:t>
@@ -4083,6 +5295,10 @@
     <w:p/>
     <w:p>
       <w:r>
+        <w:rPr>
+          <w:b w:val="0"/>
+          <w:i w:val="0"/>
+        </w:rPr>
         <w:t xml:space="preserve">See also: </w:t>
       </w:r>
       <w:hyperlink r:id="rId28">
@@ -4095,6 +5311,10 @@
         </w:r>
       </w:hyperlink>
       <w:r>
+        <w:rPr>
+          <w:b w:val="0"/>
+          <w:i w:val="0"/>
+        </w:rPr>
         <w:t xml:space="preserve">, </w:t>
       </w:r>
       <w:hyperlink r:id="rId29">
@@ -4107,6 +5327,10 @@
         </w:r>
       </w:hyperlink>
       <w:r>
+        <w:rPr>
+          <w:b w:val="0"/>
+          <w:i w:val="0"/>
+        </w:rPr>
         <w:t xml:space="preserve">, and the auth handoff notes in </w:t>
       </w:r>
       <w:hyperlink r:id="rId30">
@@ -4119,6 +5343,10 @@
         </w:r>
       </w:hyperlink>
       <w:r>
+        <w:rPr>
+          <w:b w:val="0"/>
+          <w:i w:val="0"/>
+        </w:rPr>
         <w:t>. &lt;/content&gt;</w:t>
       </w:r>
     </w:p>

</xml_diff>

<commit_message>
Docs: prefill and form-review sections, Draft Agreements across the handbooks
FORMS.md gains the two things it never described: where a field's value comes
from (binds, buildPrefillData's three sources, the legacy vocabulary bridge)
and how a form's placement is checked (the x1.5 trap, the two-pass page review
and its ledger gate, where the NL/NB sweep stands). Includes the caveat found
while writing it -- Save Document posts every field, so the first save marks the
whole document manual and it stops picking up matter changes.

ARCHITECTURE.md adds /agreement-chat and /agreement-pdf, and the agreement
PDF's two hops: Flask renders the bytes, the frontend files them.

DATABASE.html was missing five tables, including the MatterAgreementDocument
that MATTERS.md already pointed at. Carded all five; counts corrected.

MATTERS.md adds the source docx and question ledger the agreement is measured
against, plus its test suites.

Co-Authored-By: Claude Opus 5 <noreply@anthropic.com>
</commit_message>
<xml_diff>
--- a/docs/ARCHITECTURE.docx
+++ b/docs/ARCHITECTURE.docx
@@ -341,7 +341,7 @@
         <w:br/>
         <w:t xml:space="preserve">    subgraph AWS["AWS RDS — PostgreSQL"]</w:t>
         <w:br/>
-        <w:t xml:space="preserve">      DB[(matters, forms, folders,&lt;br/&gt;users, tasks)]</w:t>
+        <w:t xml:space="preserve">      DB[(matters, forms, folders,&lt;br/&gt;agreements, users, tasks)]</w:t>
         <w:br/>
         <w:t xml:space="preserve">    end</w:t>
         <w:br/>
@@ -355,7 +355,7 @@
         <w:br/>
         <w:t xml:space="preserve">    UI --&gt;|REACT_APP_API_BASE_URL&lt;br/&gt;login, matters, forms, folders| AUTH</w:t>
         <w:br/>
-        <w:t xml:space="preserve">    UI --&gt;|CALCULATOR_API&lt;br/&gt;/chat, /intake-chat, /update-chat, /download-report| FLASK</w:t>
+        <w:t xml:space="preserve">    UI --&gt;|CALCULATOR_API&lt;br/&gt;/chat, /intake-chat, /update-chat,&lt;br/&gt;/agreement-chat, /agreement-pdf, /download-report| FLASK</w:t>
         <w:br/>
         <w:t xml:space="preserve">    AUTH --&gt;|DATABASE_URL Prisma/pg over SSL| DB</w:t>
         <w:br/>
@@ -2011,7 +2011,21 @@
           <w:b w:val="0"/>
           <w:i w:val="0"/>
         </w:rPr>
-        <w:t xml:space="preserve">). It handles every conversational feature and every generated PDF: the child and spousal support calculators, the matter-intake agent, the update-information agent, and the downloadable reports. It is </w:t>
+        <w:t xml:space="preserve">). It handles every conversational feature and every generated PDF: the child and spousal support calculators, the matter-intake agent, the update-information agent, the </w:t>
+      </w:r>
+      <w:r>
+        <w:rPr>
+          <w:b/>
+          <w:i w:val="0"/>
+        </w:rPr>
+        <w:t>agreement-drafting agent</w:t>
+      </w:r>
+      <w:r>
+        <w:rPr>
+          <w:b w:val="0"/>
+          <w:i w:val="0"/>
+        </w:rPr>
+        <w:t xml:space="preserve">, and the downloadable reports. It is </w:t>
       </w:r>
       <w:r>
         <w:rPr>
@@ -2442,23 +2456,97 @@
       </w:pPr>
       <w:r>
         <w:rPr>
+          <w:rFonts w:ascii="Consolas" w:hAnsi="Consolas"/>
           <w:b/>
           <w:i w:val="0"/>
-        </w:rPr>
-        <w:t>Free-instance cold starts.</w:t>
+          <w:sz w:val="19"/>
+        </w:rPr>
+        <w:t>/agreement-pdf</w:t>
+      </w:r>
+      <w:r>
+        <w:rPr>
+          <w:b/>
+          <w:i w:val="0"/>
+        </w:rPr>
+        <w:t xml:space="preserve"> is the one endpoint that renders someone else's HTML.</w:t>
       </w:r>
       <w:r>
         <w:rPr>
           <w:b w:val="0"/>
           <w:i w:val="0"/>
         </w:rPr>
-        <w:t xml:space="preserve"> A Free Render web service goes to sleep when idle and takes roughly 30–60 seconds to start again. That is why the chat panels show </w:t>
+        <w:t xml:space="preserve"> Draft Agreements shows the lawyer a live HTML document, then posts </w:t>
       </w:r>
       <w:r>
         <w:rPr>
           <w:b w:val="0"/>
           <w:i/>
         </w:rPr>
+        <w:t>that same markup</w:t>
+      </w:r>
+      <w:r>
+        <w:rPr>
+          <w:b w:val="0"/>
+          <w:i w:val="0"/>
+        </w:rPr>
+        <w:t xml:space="preserve"> here to be turned into a PDF by </w:t>
+      </w:r>
+      <w:r>
+        <w:rPr>
+          <w:rFonts w:ascii="Consolas" w:hAnsi="Consolas"/>
+          <w:b w:val="0"/>
+          <w:i w:val="0"/>
+          <w:sz w:val="19"/>
+        </w:rPr>
+        <w:t>xhtml2pdf</w:t>
+      </w:r>
+      <w:r>
+        <w:rPr>
+          <w:b w:val="0"/>
+          <w:i w:val="0"/>
+        </w:rPr>
+        <w:t xml:space="preserve"> — the same library </w:t>
+      </w:r>
+      <w:hyperlink r:id="rId22">
+        <w:r>
+          <w:rPr>
+            <w:color w:val="0563C1"/>
+            <w:u w:val="single"/>
+          </w:rPr>
+          <w:t>report_pdf.py</w:t>
+        </w:r>
+      </w:hyperlink>
+      <w:r>
+        <w:rPr>
+          <w:b w:val="0"/>
+          <w:i w:val="0"/>
+        </w:rPr>
+        <w:t xml:space="preserve"> uses for the calculation reports — so the export matches what was on screen. Flask returns the bytes and keeps nothing; the frontend is what files them (see the request-flow note below).</w:t>
+      </w:r>
+    </w:p>
+    <w:p>
+      <w:pPr>
+        <w:pStyle w:val="IntenseQuote"/>
+      </w:pPr>
+      <w:r>
+        <w:rPr>
+          <w:b/>
+          <w:i w:val="0"/>
+        </w:rPr>
+        <w:t>Free-instance cold starts.</w:t>
+      </w:r>
+      <w:r>
+        <w:rPr>
+          <w:b w:val="0"/>
+          <w:i w:val="0"/>
+        </w:rPr>
+        <w:t xml:space="preserve"> A Free Render web service goes to sleep when idle and takes roughly 30–60 seconds to start again. That is why the chat panels show </w:t>
+      </w:r>
+      <w:r>
+        <w:rPr>
+          <w:b w:val="0"/>
+          <w:i/>
+        </w:rPr>
         <w:t>"Warming up the server — first reply can take ~30s…"</w:t>
       </w:r>
       <w:r>
@@ -2468,7 +2556,7 @@
         </w:rPr>
         <w:t xml:space="preserve"> and why the frontend axios timeout is 75s (</w:t>
       </w:r>
-      <w:hyperlink r:id="rId22">
+      <w:hyperlink r:id="rId23">
         <w:r>
           <w:rPr>
             <w:color w:val="0563C1"/>
@@ -2528,7 +2616,7 @@
                     <pic:cNvPicPr/>
                   </pic:nvPicPr>
                   <pic:blipFill>
-                    <a:blip r:embed="rId23"/>
+                    <a:blip r:embed="rId24"/>
                     <a:stretch>
                       <a:fillRect/>
                     </a:stretch>
@@ -2583,7 +2671,7 @@
         </w:rPr>
         <w:t xml:space="preserve">, entry </w:t>
       </w:r>
-      <w:hyperlink r:id="rId24">
+      <w:hyperlink r:id="rId25">
         <w:r>
           <w:rPr>
             <w:color w:val="0563C1"/>
@@ -2671,7 +2759,7 @@
         </w:rPr>
         <w:t xml:space="preserve"> — the app data: matters, forms, folders, task states, form-template PDFs (everything </w:t>
       </w:r>
-      <w:hyperlink r:id="rId25">
+      <w:hyperlink r:id="rId26">
         <w:r>
           <w:rPr>
             <w:color w:val="0563C1"/>
@@ -2685,7 +2773,71 @@
           <w:b w:val="0"/>
           <w:i w:val="0"/>
         </w:rPr>
-        <w:t xml:space="preserve"> and the matter Redux actions call).</w:t>
+        <w:t xml:space="preserve"> and the matter Redux actions call), plus the newer sibling routers — </w:t>
+      </w:r>
+      <w:r>
+        <w:rPr>
+          <w:rFonts w:ascii="Consolas" w:hAnsi="Consolas"/>
+          <w:b w:val="0"/>
+          <w:i w:val="0"/>
+          <w:sz w:val="19"/>
+        </w:rPr>
+        <w:t>agreementRoutes.js</w:t>
+      </w:r>
+      <w:r>
+        <w:rPr>
+          <w:b w:val="0"/>
+          <w:i w:val="0"/>
+        </w:rPr>
+        <w:t xml:space="preserve"> (a drafted agreement's answers, transcript and generated PDF), </w:t>
+      </w:r>
+      <w:r>
+        <w:rPr>
+          <w:rFonts w:ascii="Consolas" w:hAnsi="Consolas"/>
+          <w:b w:val="0"/>
+          <w:i w:val="0"/>
+          <w:sz w:val="19"/>
+        </w:rPr>
+        <w:t>calculationReportsRoutes.js</w:t>
+      </w:r>
+      <w:r>
+        <w:rPr>
+          <w:b w:val="0"/>
+          <w:i w:val="0"/>
+        </w:rPr>
+        <w:t xml:space="preserve">, </w:t>
+      </w:r>
+      <w:r>
+        <w:rPr>
+          <w:rFonts w:ascii="Consolas" w:hAnsi="Consolas"/>
+          <w:b w:val="0"/>
+          <w:i w:val="0"/>
+          <w:sz w:val="19"/>
+        </w:rPr>
+        <w:t>computationResultsRoutes.js</w:t>
+      </w:r>
+      <w:r>
+        <w:rPr>
+          <w:b w:val="0"/>
+          <w:i w:val="0"/>
+        </w:rPr>
+        <w:t xml:space="preserve"> and </w:t>
+      </w:r>
+      <w:r>
+        <w:rPr>
+          <w:rFonts w:ascii="Consolas" w:hAnsi="Consolas"/>
+          <w:b w:val="0"/>
+          <w:i w:val="0"/>
+          <w:sz w:val="19"/>
+        </w:rPr>
+        <w:t>lawyerContactsRoutes.js</w:t>
+      </w:r>
+      <w:r>
+        <w:rPr>
+          <w:b w:val="0"/>
+          <w:i w:val="0"/>
+        </w:rPr>
+        <w:t>.</w:t>
       </w:r>
     </w:p>
     <w:p>
@@ -2772,7 +2924,7 @@
         </w:rPr>
         <w:t xml:space="preserve"> (see </w:t>
       </w:r>
-      <w:hyperlink r:id="rId26">
+      <w:hyperlink r:id="rId27">
         <w:r>
           <w:rPr>
             <w:color w:val="0563C1"/>
@@ -2910,7 +3062,7 @@
               </w:rPr>
               <w:t xml:space="preserve"> hosts (</w:t>
             </w:r>
-            <w:hyperlink r:id="rId27">
+            <w:hyperlink r:id="rId28">
               <w:r>
                 <w:rPr>
                   <w:color w:val="0563C1"/>
@@ -3603,7 +3755,7 @@
         </w:rPr>
         <w:t xml:space="preserve">Connection: </w:t>
       </w:r>
-      <w:hyperlink r:id="rId27">
+      <w:hyperlink r:id="rId28">
         <w:r>
           <w:rPr>
             <w:color w:val="0563C1"/>
@@ -4677,6 +4829,103 @@
           <w:b/>
           <w:i w:val="0"/>
         </w:rPr>
+        <w:t>Generate an agreement PDF</w:t>
+      </w:r>
+      <w:r>
+        <w:rPr>
+          <w:b w:val="0"/>
+          <w:i w:val="0"/>
+        </w:rPr>
+        <w:t xml:space="preserve"> → two hops, in that order: browser → </w:t>
+      </w:r>
+      <w:r>
+        <w:rPr>
+          <w:rFonts w:ascii="Consolas" w:hAnsi="Consolas"/>
+          <w:b w:val="0"/>
+          <w:i w:val="0"/>
+          <w:sz w:val="19"/>
+        </w:rPr>
+        <w:t>CALCULATOR_API</w:t>
+      </w:r>
+      <w:r>
+        <w:rPr>
+          <w:b w:val="0"/>
+          <w:i w:val="0"/>
+        </w:rPr>
+        <w:t xml:space="preserve"> </w:t>
+      </w:r>
+      <w:r>
+        <w:rPr>
+          <w:rFonts w:ascii="Consolas" w:hAnsi="Consolas"/>
+          <w:b w:val="0"/>
+          <w:i w:val="0"/>
+          <w:sz w:val="19"/>
+        </w:rPr>
+        <w:t>POST /agreement-pdf</w:t>
+      </w:r>
+      <w:r>
+        <w:rPr>
+          <w:b w:val="0"/>
+          <w:i w:val="0"/>
+        </w:rPr>
+        <w:t xml:space="preserve"> (HTML in, PDF bytes out, nothing stored) → browser → </w:t>
+      </w:r>
+      <w:r>
+        <w:rPr>
+          <w:rFonts w:ascii="Consolas" w:hAnsi="Consolas"/>
+          <w:b w:val="0"/>
+          <w:i w:val="0"/>
+          <w:sz w:val="19"/>
+        </w:rPr>
+        <w:t>REACT_APP_API_BASE_URL</w:t>
+      </w:r>
+      <w:r>
+        <w:rPr>
+          <w:b w:val="0"/>
+          <w:i w:val="0"/>
+        </w:rPr>
+        <w:t xml:space="preserve"> </w:t>
+      </w:r>
+      <w:r>
+        <w:rPr>
+          <w:rFonts w:ascii="Consolas" w:hAnsi="Consolas"/>
+          <w:b w:val="0"/>
+          <w:i w:val="0"/>
+          <w:sz w:val="19"/>
+        </w:rPr>
+        <w:t>PUT /v1/matters/:id/agreements/:type/pdf</w:t>
+      </w:r>
+      <w:r>
+        <w:rPr>
+          <w:b w:val="0"/>
+          <w:i w:val="0"/>
+        </w:rPr>
+        <w:t xml:space="preserve"> → </w:t>
+      </w:r>
+      <w:r>
+        <w:rPr>
+          <w:b/>
+          <w:i w:val="0"/>
+        </w:rPr>
+        <w:t>AWS RDS</w:t>
+      </w:r>
+      <w:r>
+        <w:rPr>
+          <w:b w:val="0"/>
+          <w:i w:val="0"/>
+        </w:rPr>
+        <w:t>. If a draft renders on screen but never appears in the matter's folder, it is the second hop that failed, not the first.</w:t>
+      </w:r>
+    </w:p>
+    <w:p>
+      <w:pPr>
+        <w:pStyle w:val="ListBullet"/>
+      </w:pPr>
+      <w:r>
+        <w:rPr>
+          <w:b/>
+          <w:i w:val="0"/>
+        </w:rPr>
         <w:t>Sign up / reset password</w:t>
       </w:r>
       <w:r>
@@ -5321,7 +5570,7 @@
         </w:rPr>
         <w:t xml:space="preserve">See also: </w:t>
       </w:r>
-      <w:hyperlink r:id="rId28">
+      <w:hyperlink r:id="rId29">
         <w:r>
           <w:rPr>
             <w:color w:val="0563C1"/>
@@ -5337,7 +5586,7 @@
         </w:rPr>
         <w:t xml:space="preserve">, </w:t>
       </w:r>
-      <w:hyperlink r:id="rId29">
+      <w:hyperlink r:id="rId30">
         <w:r>
           <w:rPr>
             <w:color w:val="0563C1"/>
@@ -5353,7 +5602,7 @@
         </w:rPr>
         <w:t xml:space="preserve">, </w:t>
       </w:r>
-      <w:hyperlink r:id="rId30">
+      <w:hyperlink r:id="rId31">
         <w:r>
           <w:rPr>
             <w:color w:val="0563C1"/>
@@ -5369,7 +5618,7 @@
         </w:rPr>
         <w:t xml:space="preserve"> (every table and column, rendered — open it in a browser), and the auth handoff notes in </w:t>
       </w:r>
-      <w:hyperlink r:id="rId31">
+      <w:hyperlink r:id="rId32">
         <w:r>
           <w:rPr>
             <w:color w:val="0563C1"/>

</xml_diff>